<commit_message>
Tree: Completed Tree construction notes
</commit_message>
<xml_diff>
--- a/07. Tree/Tree.docx
+++ b/07. Tree/Tree.docx
@@ -8300,7 +8300,6 @@
           <w:rFonts w:cstheme="majorHAnsi"/>
           <w:sz w:val="40"/>
         </w:rPr>
-        <w:lastRenderedPageBreak/>
         <w:t>LEVEL 1:</w:t>
       </w:r>
       <w:r>
@@ -9252,7 +9251,6 @@
           <w:rFonts w:cstheme="majorHAnsi"/>
           <w:sz w:val="40"/>
         </w:rPr>
-        <w:lastRenderedPageBreak/>
         <w:t>LEVEL 2</w:t>
       </w:r>
       <w:r>
@@ -9946,6 +9944,11 @@
       </w:r>
     </w:p>
     <w:p>
+      <w:r>
+        <w:t>Black question in video, add extra similar question to practice</w:t>
+      </w:r>
+    </w:p>
+    <w:p>
       <w:pPr>
         <w:pStyle w:val="Heading2"/>
         <w:rPr>
@@ -11331,7 +11334,6 @@
           <w:b/>
           <w:sz w:val="28"/>
         </w:rPr>
-        <w:lastRenderedPageBreak/>
         <w:t>Pattern 4</w:t>
       </w:r>
       <w:r>
@@ -11846,6 +11848,258 @@
           <w:b/>
           <w:sz w:val="28"/>
         </w:rPr>
+        <w:t xml:space="preserve"> —</w:t>
+      </w:r>
+      <w:r>
+        <w:rPr>
+          <w:b/>
+          <w:sz w:val="28"/>
+        </w:rPr>
+        <w:t xml:space="preserve"> Tree Views</w:t>
+      </w:r>
+    </w:p>
+    <w:p>
+      <w:pPr>
+        <w:pStyle w:val="ListParagraph"/>
+        <w:numPr>
+          <w:ilvl w:val="0"/>
+          <w:numId w:val="38"/>
+        </w:numPr>
+        <w:rPr>
+          <w:color w:val="FF0000"/>
+        </w:rPr>
+      </w:pPr>
+      <w:r>
+        <w:rPr>
+          <w:color w:val="FF0000"/>
+        </w:rPr>
+        <w:t>Binary Tree Right Side View (199)</w:t>
+      </w:r>
+      <w:r>
+        <w:rPr>
+          <w:color w:val="FF0000"/>
+        </w:rPr>
+        <w:tab/>
+      </w:r>
+      <w:proofErr w:type="spellStart"/>
+      <w:r>
+        <w:rPr>
+          <w:color w:val="FF0000"/>
+        </w:rPr>
+        <w:t>LeetCode</w:t>
+      </w:r>
+      <w:proofErr w:type="spellEnd"/>
+      <w:r>
+        <w:rPr>
+          <w:color w:val="FF0000"/>
+        </w:rPr>
+        <w:tab/>
+      </w:r>
+      <w:r>
+        <w:rPr>
+          <w:rFonts w:ascii="Calibri" w:hAnsi="Calibri" w:cs="Calibri"/>
+          <w:color w:val="FF0000"/>
+        </w:rPr>
+        <w:t>🟡</w:t>
+      </w:r>
+      <w:r>
+        <w:rPr>
+          <w:color w:val="FF0000"/>
+        </w:rPr>
+        <w:t xml:space="preserve"> Medium</w:t>
+      </w:r>
+    </w:p>
+    <w:p>
+      <w:pPr>
+        <w:pStyle w:val="ListParagraph"/>
+        <w:numPr>
+          <w:ilvl w:val="0"/>
+          <w:numId w:val="38"/>
+        </w:numPr>
+      </w:pPr>
+      <w:r>
+        <w:t>Find Bottom Left Tree Value (513)</w:t>
+      </w:r>
+      <w:r>
+        <w:tab/>
+      </w:r>
+      <w:proofErr w:type="spellStart"/>
+      <w:r>
+        <w:t>LeetCode</w:t>
+      </w:r>
+      <w:proofErr w:type="spellEnd"/>
+      <w:r>
+        <w:tab/>
+      </w:r>
+      <w:r>
+        <w:rPr>
+          <w:rFonts w:ascii="Calibri" w:hAnsi="Calibri" w:cs="Calibri"/>
+        </w:rPr>
+        <w:t>🟡</w:t>
+      </w:r>
+      <w:r>
+        <w:t xml:space="preserve"> Medium</w:t>
+      </w:r>
+    </w:p>
+    <w:p>
+      <w:pPr>
+        <w:pStyle w:val="ListParagraph"/>
+        <w:numPr>
+          <w:ilvl w:val="0"/>
+          <w:numId w:val="38"/>
+        </w:numPr>
+        <w:rPr>
+          <w:color w:val="FF0000"/>
+        </w:rPr>
+      </w:pPr>
+      <w:r>
+        <w:rPr>
+          <w:color w:val="FF0000"/>
+        </w:rPr>
+        <w:t>Boundary Traversal of Binary Tree</w:t>
+      </w:r>
+      <w:r>
+        <w:rPr>
+          <w:color w:val="FF0000"/>
+        </w:rPr>
+        <w:tab/>
+      </w:r>
+      <w:proofErr w:type="spellStart"/>
+      <w:r>
+        <w:rPr>
+          <w:color w:val="FF0000"/>
+        </w:rPr>
+        <w:t>GeeksforGeeks</w:t>
+      </w:r>
+      <w:proofErr w:type="spellEnd"/>
+      <w:r>
+        <w:rPr>
+          <w:color w:val="FF0000"/>
+        </w:rPr>
+        <w:tab/>
+      </w:r>
+      <w:r>
+        <w:rPr>
+          <w:rFonts w:ascii="Calibri" w:hAnsi="Calibri" w:cs="Calibri"/>
+          <w:color w:val="FF0000"/>
+        </w:rPr>
+        <w:t>🟡</w:t>
+      </w:r>
+      <w:r>
+        <w:rPr>
+          <w:color w:val="FF0000"/>
+        </w:rPr>
+        <w:t xml:space="preserve"> Medium</w:t>
+      </w:r>
+    </w:p>
+    <w:p>
+      <w:pPr>
+        <w:pStyle w:val="ListParagraph"/>
+        <w:numPr>
+          <w:ilvl w:val="0"/>
+          <w:numId w:val="38"/>
+        </w:numPr>
+        <w:rPr>
+          <w:color w:val="FF0000"/>
+        </w:rPr>
+      </w:pPr>
+      <w:r>
+        <w:rPr>
+          <w:color w:val="FF0000"/>
+        </w:rPr>
+        <w:t>Top View of Binary Tree</w:t>
+      </w:r>
+      <w:r>
+        <w:rPr>
+          <w:color w:val="FF0000"/>
+        </w:rPr>
+        <w:tab/>
+      </w:r>
+      <w:proofErr w:type="spellStart"/>
+      <w:r>
+        <w:rPr>
+          <w:color w:val="FF0000"/>
+        </w:rPr>
+        <w:t>GeeksforGeeks</w:t>
+      </w:r>
+      <w:proofErr w:type="spellEnd"/>
+      <w:r>
+        <w:rPr>
+          <w:color w:val="FF0000"/>
+        </w:rPr>
+        <w:tab/>
+      </w:r>
+      <w:r>
+        <w:rPr>
+          <w:rFonts w:ascii="Calibri" w:hAnsi="Calibri" w:cs="Calibri"/>
+          <w:color w:val="FF0000"/>
+        </w:rPr>
+        <w:t>🟡</w:t>
+      </w:r>
+      <w:r>
+        <w:rPr>
+          <w:color w:val="FF0000"/>
+        </w:rPr>
+        <w:t xml:space="preserve"> Medium</w:t>
+      </w:r>
+    </w:p>
+    <w:p>
+      <w:pPr>
+        <w:pStyle w:val="ListParagraph"/>
+        <w:numPr>
+          <w:ilvl w:val="0"/>
+          <w:numId w:val="38"/>
+        </w:numPr>
+      </w:pPr>
+      <w:r>
+        <w:t>Bottom View of Binary Tree</w:t>
+      </w:r>
+      <w:r>
+        <w:tab/>
+      </w:r>
+      <w:proofErr w:type="spellStart"/>
+      <w:r>
+        <w:t>GeeksforGeeks</w:t>
+      </w:r>
+      <w:proofErr w:type="spellEnd"/>
+      <w:r>
+        <w:tab/>
+      </w:r>
+      <w:r>
+        <w:rPr>
+          <w:rFonts w:ascii="Calibri" w:hAnsi="Calibri" w:cs="Calibri"/>
+        </w:rPr>
+        <w:t>🟡</w:t>
+      </w:r>
+      <w:r>
+        <w:t xml:space="preserve"> Medium</w:t>
+      </w:r>
+    </w:p>
+    <w:p>
+      <w:pPr>
+        <w:pStyle w:val="ListParagraph"/>
+      </w:pPr>
+    </w:p>
+    <w:p/>
+    <w:p>
+      <w:pPr>
+        <w:pStyle w:val="Heading2"/>
+        <w:rPr>
+          <w:b/>
+        </w:rPr>
+      </w:pPr>
+      <w:r>
+        <w:rPr>
+          <w:b/>
+          <w:sz w:val="28"/>
+        </w:rPr>
+        <w:t>Pattern 6</w:t>
+      </w:r>
+      <w:r>
+        <w:rPr>
+          <w:b/>
+          <w:sz w:val="28"/>
+        </w:rPr>
         <w:t>—</w:t>
       </w:r>
       <w:r>
@@ -11871,35 +12125,7 @@
         <w:rPr>
           <w:color w:val="FF0000"/>
         </w:rPr>
-        <w:t xml:space="preserve">Construct Binary Tree from </w:t>
-      </w:r>
-      <w:proofErr w:type="spellStart"/>
-      <w:r>
-        <w:rPr>
-          <w:color w:val="FF0000"/>
-        </w:rPr>
-        <w:t>Preorder</w:t>
-      </w:r>
-      <w:proofErr w:type="spellEnd"/>
-      <w:r>
-        <w:rPr>
-          <w:color w:val="FF0000"/>
-        </w:rPr>
-        <w:t xml:space="preserve"> and </w:t>
-      </w:r>
-      <w:proofErr w:type="spellStart"/>
-      <w:r>
-        <w:rPr>
-          <w:color w:val="FF0000"/>
-        </w:rPr>
-        <w:t>Inorder</w:t>
-      </w:r>
-      <w:proofErr w:type="spellEnd"/>
-      <w:r>
-        <w:rPr>
-          <w:color w:val="FF0000"/>
-        </w:rPr>
-        <w:t xml:space="preserve"> Traversal (105)</w:t>
+        <w:t>Convert Sorted Array to BST (108)</w:t>
       </w:r>
       <w:r>
         <w:rPr>
@@ -11926,24 +12152,14 @@
           <w:rFonts w:ascii="Calibri" w:hAnsi="Calibri" w:cs="Calibri"/>
           <w:color w:val="FF0000"/>
         </w:rPr>
-        <w:t>🟡</w:t>
+        <w:t>🟢</w:t>
       </w:r>
       <w:r>
         <w:rPr>
           <w:color w:val="FF0000"/>
         </w:rPr>
-        <w:t xml:space="preserve"> Medium</w:t>
-      </w:r>
-    </w:p>
-    <w:p>
-      <w:pPr>
-        <w:pStyle w:val="ListParagraph"/>
-        <w:rPr>
-          <w:color w:val="FF0000"/>
-        </w:rPr>
-      </w:pPr>
-      <w:bookmarkStart w:id="30" w:name="_GoBack"/>
-      <w:bookmarkEnd w:id="30"/>
+        <w:t xml:space="preserve"> Easy</w:t>
+      </w:r>
     </w:p>
     <w:p>
       <w:pPr>
@@ -11952,44 +12168,75 @@
           <w:ilvl w:val="0"/>
           <w:numId w:val="40"/>
         </w:numPr>
-      </w:pPr>
-      <w:r>
+        <w:rPr>
+          <w:color w:val="FF0000"/>
+        </w:rPr>
+      </w:pPr>
+      <w:r>
+        <w:rPr>
+          <w:color w:val="FF0000"/>
+        </w:rPr>
         <w:t xml:space="preserve">Construct Binary Tree from </w:t>
       </w:r>
       <w:proofErr w:type="spellStart"/>
       <w:r>
+        <w:rPr>
+          <w:color w:val="FF0000"/>
+        </w:rPr>
+        <w:t>Preorder</w:t>
+      </w:r>
+      <w:proofErr w:type="spellEnd"/>
+      <w:r>
+        <w:rPr>
+          <w:color w:val="FF0000"/>
+        </w:rPr>
+        <w:t xml:space="preserve"> and </w:t>
+      </w:r>
+      <w:proofErr w:type="spellStart"/>
+      <w:r>
+        <w:rPr>
+          <w:color w:val="FF0000"/>
+        </w:rPr>
         <w:t>Inorder</w:t>
       </w:r>
       <w:proofErr w:type="spellEnd"/>
       <w:r>
-        <w:t xml:space="preserve"> and </w:t>
+        <w:rPr>
+          <w:color w:val="FF0000"/>
+        </w:rPr>
+        <w:t xml:space="preserve"> Traversal (105)</w:t>
+      </w:r>
+      <w:r>
+        <w:rPr>
+          <w:color w:val="FF0000"/>
+        </w:rPr>
+        <w:tab/>
       </w:r>
       <w:proofErr w:type="spellStart"/>
       <w:r>
-        <w:t>Postorder</w:t>
+        <w:rPr>
+          <w:color w:val="FF0000"/>
+        </w:rPr>
+        <w:t>LeetCode</w:t>
       </w:r>
       <w:proofErr w:type="spellEnd"/>
       <w:r>
-        <w:t xml:space="preserve"> Traversal (106)</w:t>
-      </w:r>
-      <w:r>
+        <w:rPr>
+          <w:color w:val="FF0000"/>
+        </w:rPr>
         <w:tab/>
       </w:r>
-      <w:proofErr w:type="spellStart"/>
-      <w:r>
-        <w:t>LeetCode</w:t>
-      </w:r>
-      <w:proofErr w:type="spellEnd"/>
-      <w:r>
-        <w:tab/>
-      </w:r>
       <w:r>
         <w:rPr>
           <w:rFonts w:ascii="Calibri" w:hAnsi="Calibri" w:cs="Calibri"/>
+          <w:color w:val="FF0000"/>
         </w:rPr>
         <w:t>🟡</w:t>
       </w:r>
       <w:r>
+        <w:rPr>
+          <w:color w:val="FF0000"/>
+        </w:rPr>
         <w:t xml:space="preserve"> Medium</w:t>
       </w:r>
     </w:p>
@@ -12002,27 +12249,71 @@
         </w:numPr>
       </w:pPr>
       <w:r>
-        <w:t>Convert Sorted Array to BST (108)</w:t>
-      </w:r>
-      <w:r>
+        <w:rPr>
+          <w:color w:val="FF0000"/>
+        </w:rPr>
+        <w:t xml:space="preserve">Construct Binary Tree from </w:t>
+      </w:r>
+      <w:proofErr w:type="spellStart"/>
+      <w:r>
+        <w:rPr>
+          <w:color w:val="FF0000"/>
+        </w:rPr>
+        <w:t>Inorder</w:t>
+      </w:r>
+      <w:proofErr w:type="spellEnd"/>
+      <w:r>
+        <w:rPr>
+          <w:color w:val="FF0000"/>
+        </w:rPr>
+        <w:t xml:space="preserve"> and </w:t>
+      </w:r>
+      <w:proofErr w:type="spellStart"/>
+      <w:r>
+        <w:rPr>
+          <w:color w:val="FF0000"/>
+        </w:rPr>
+        <w:t>Postorder</w:t>
+      </w:r>
+      <w:proofErr w:type="spellEnd"/>
+      <w:r>
+        <w:rPr>
+          <w:color w:val="FF0000"/>
+        </w:rPr>
+        <w:t xml:space="preserve"> Traversal (106)</w:t>
+      </w:r>
+      <w:r>
+        <w:rPr>
+          <w:color w:val="FF0000"/>
+        </w:rPr>
         <w:tab/>
       </w:r>
       <w:proofErr w:type="spellStart"/>
       <w:r>
+        <w:rPr>
+          <w:color w:val="FF0000"/>
+        </w:rPr>
         <w:t>LeetCode</w:t>
       </w:r>
       <w:proofErr w:type="spellEnd"/>
       <w:r>
+        <w:rPr>
+          <w:color w:val="FF0000"/>
+        </w:rPr>
         <w:tab/>
       </w:r>
       <w:r>
         <w:rPr>
           <w:rFonts w:ascii="Calibri" w:hAnsi="Calibri" w:cs="Calibri"/>
-        </w:rPr>
-        <w:t>🟢</w:t>
-      </w:r>
-      <w:r>
-        <w:t xml:space="preserve"> Easy</w:t>
+          <w:color w:val="FF0000"/>
+        </w:rPr>
+        <w:t>🟡</w:t>
+      </w:r>
+      <w:r>
+        <w:rPr>
+          <w:color w:val="FF0000"/>
+        </w:rPr>
+        <w:t xml:space="preserve"> Medium</w:t>
       </w:r>
     </w:p>
     <w:p>
@@ -12066,43 +12357,24 @@
         </w:numPr>
       </w:pPr>
       <w:r>
-        <w:t xml:space="preserve">Construct Binary Tree from </w:t>
+        <w:t>Convert Binary Tree to Doubly Linked List</w:t>
+      </w:r>
+      <w:r>
+        <w:tab/>
       </w:r>
       <w:proofErr w:type="spellStart"/>
       <w:r>
-        <w:t>Preorder</w:t>
+        <w:t>GeeksforGeeks</w:t>
       </w:r>
       <w:proofErr w:type="spellEnd"/>
       <w:r>
-        <w:t xml:space="preserve"> &amp; </w:t>
-      </w:r>
-      <w:proofErr w:type="spellStart"/>
-      <w:r>
-        <w:t>Postorder</w:t>
-      </w:r>
-      <w:proofErr w:type="spellEnd"/>
-      <w:r>
-        <w:t xml:space="preserve"> (889)</w:t>
-      </w:r>
-      <w:r>
         <w:tab/>
       </w:r>
-      <w:proofErr w:type="spellStart"/>
-      <w:r>
-        <w:t>LeetCode</w:t>
-      </w:r>
-      <w:proofErr w:type="spellEnd"/>
-      <w:r>
-        <w:tab/>
-      </w:r>
       <w:r>
         <w:rPr>
           <w:rFonts w:ascii="Calibri" w:hAnsi="Calibri" w:cs="Calibri"/>
         </w:rPr>
         <w:t>🟡</w:t>
-      </w:r>
-      <w:r>
-        <w:t xml:space="preserve"> Medium</w:t>
       </w:r>
     </w:p>
     <w:p>
@@ -12112,37 +12384,48 @@
           <w:ilvl w:val="0"/>
           <w:numId w:val="40"/>
         </w:numPr>
-      </w:pPr>
-      <w:r>
-        <w:t xml:space="preserve">Recover a Tree From </w:t>
+        <w:rPr>
+          <w:color w:val="FF0000"/>
+        </w:rPr>
+      </w:pPr>
+      <w:r>
+        <w:rPr>
+          <w:color w:val="FF0000"/>
+        </w:rPr>
+        <w:t>Flatten Binary Tree to Linked List (114)</w:t>
+      </w:r>
+      <w:r>
+        <w:rPr>
+          <w:color w:val="FF0000"/>
+        </w:rPr>
+        <w:tab/>
       </w:r>
       <w:proofErr w:type="spellStart"/>
       <w:r>
-        <w:t>Preorder</w:t>
+        <w:rPr>
+          <w:color w:val="FF0000"/>
+        </w:rPr>
+        <w:t>LeetCode</w:t>
       </w:r>
       <w:proofErr w:type="spellEnd"/>
       <w:r>
-        <w:t xml:space="preserve"> Traversal (1028)</w:t>
-      </w:r>
-      <w:r>
+        <w:rPr>
+          <w:color w:val="FF0000"/>
+        </w:rPr>
         <w:tab/>
       </w:r>
-      <w:proofErr w:type="spellStart"/>
-      <w:r>
-        <w:t>LeetCode</w:t>
-      </w:r>
-      <w:proofErr w:type="spellEnd"/>
-      <w:r>
-        <w:tab/>
-      </w:r>
-      <w:r>
-        <w:rPr>
-          <w:rFonts w:ascii="Segoe UI Symbol" w:hAnsi="Segoe UI Symbol" w:cs="Segoe UI Symbol"/>
-        </w:rPr>
-        <w:t>🔴</w:t>
-      </w:r>
-      <w:r>
-        <w:t xml:space="preserve"> Hard</w:t>
+      <w:r>
+        <w:rPr>
+          <w:rFonts w:ascii="Calibri" w:hAnsi="Calibri" w:cs="Calibri"/>
+          <w:color w:val="FF0000"/>
+        </w:rPr>
+        <w:t>🟡</w:t>
+      </w:r>
+      <w:r>
+        <w:rPr>
+          <w:color w:val="FF0000"/>
+        </w:rPr>
+        <w:t xml:space="preserve"> Medium</w:t>
       </w:r>
     </w:p>
     <w:p>
@@ -12152,391 +12435,70 @@
           <w:ilvl w:val="0"/>
           <w:numId w:val="40"/>
         </w:numPr>
-      </w:pPr>
-      <w:r>
-        <w:t>Convert Binary Tree to Doubly Linked List</w:t>
-      </w:r>
-      <w:r>
+        <w:rPr>
+          <w:color w:val="FF0000"/>
+        </w:rPr>
+      </w:pPr>
+      <w:r>
+        <w:rPr>
+          <w:color w:val="FF0000"/>
+        </w:rPr>
+        <w:t>Populating Next Right Pointers in Each Node (116)</w:t>
+      </w:r>
+      <w:r>
+        <w:rPr>
+          <w:color w:val="FF0000"/>
+        </w:rPr>
         <w:tab/>
       </w:r>
       <w:proofErr w:type="spellStart"/>
       <w:r>
-        <w:t>GeeksforGeeks</w:t>
+        <w:rPr>
+          <w:color w:val="FF0000"/>
+        </w:rPr>
+        <w:t>LeetCode</w:t>
       </w:r>
       <w:proofErr w:type="spellEnd"/>
       <w:r>
+        <w:rPr>
+          <w:color w:val="FF0000"/>
+        </w:rPr>
         <w:tab/>
       </w:r>
       <w:r>
         <w:rPr>
           <w:rFonts w:ascii="Calibri" w:hAnsi="Calibri" w:cs="Calibri"/>
+          <w:color w:val="FF0000"/>
         </w:rPr>
         <w:t>🟡</w:t>
       </w:r>
+      <w:r>
+        <w:rPr>
+          <w:color w:val="FF0000"/>
+        </w:rPr>
+        <w:t xml:space="preserve"> Medium</w:t>
+      </w:r>
     </w:p>
     <w:p>
       <w:pPr>
         <w:pStyle w:val="ListParagraph"/>
-        <w:numPr>
-          <w:ilvl w:val="0"/>
-          <w:numId w:val="40"/>
-        </w:numPr>
-      </w:pPr>
-      <w:r>
-        <w:t>Flatten Binary Tree to Linked List (114)</w:t>
-      </w:r>
+        <w:rPr>
+          <w:color w:val="FF0000"/>
+        </w:rPr>
+      </w:pPr>
       <w:r>
         <w:tab/>
       </w:r>
-      <w:proofErr w:type="spellStart"/>
-      <w:r>
-        <w:t>LeetCode</w:t>
-      </w:r>
-      <w:proofErr w:type="spellEnd"/>
       <w:r>
         <w:tab/>
       </w:r>
-      <w:r>
-        <w:rPr>
-          <w:rFonts w:ascii="Calibri" w:hAnsi="Calibri" w:cs="Calibri"/>
-        </w:rPr>
-        <w:t>🟡</w:t>
-      </w:r>
-      <w:r>
-        <w:t xml:space="preserve"> Medium</w:t>
-      </w:r>
     </w:p>
     <w:p>
       <w:pPr>
         <w:pStyle w:val="ListParagraph"/>
-        <w:numPr>
-          <w:ilvl w:val="0"/>
-          <w:numId w:val="40"/>
-        </w:numPr>
-      </w:pPr>
-      <w:r>
-        <w:t>Populating Next Right Pointers in Each Node (116)</w:t>
-      </w:r>
-      <w:r>
-        <w:tab/>
-      </w:r>
-      <w:proofErr w:type="spellStart"/>
-      <w:r>
-        <w:t>LeetCode</w:t>
-      </w:r>
-      <w:proofErr w:type="spellEnd"/>
-      <w:r>
-        <w:tab/>
-      </w:r>
-      <w:r>
-        <w:rPr>
-          <w:rFonts w:ascii="Calibri" w:hAnsi="Calibri" w:cs="Calibri"/>
-        </w:rPr>
-        <w:t>🟡</w:t>
-      </w:r>
-      <w:r>
-        <w:t xml:space="preserve"> Medium</w:t>
-      </w:r>
-    </w:p>
-    <w:p>
-      <w:pPr>
-        <w:pStyle w:val="ListParagraph"/>
-        <w:numPr>
-          <w:ilvl w:val="0"/>
-          <w:numId w:val="40"/>
-        </w:numPr>
-      </w:pPr>
-      <w:r>
-        <w:t>Populating Next Right Pointers II (117)</w:t>
-      </w:r>
-      <w:r>
-        <w:tab/>
-      </w:r>
-      <w:proofErr w:type="spellStart"/>
-      <w:r>
-        <w:t>LeetCode</w:t>
-      </w:r>
-      <w:proofErr w:type="spellEnd"/>
-      <w:r>
-        <w:tab/>
-      </w:r>
-      <w:r>
-        <w:rPr>
-          <w:rFonts w:ascii="Calibri" w:hAnsi="Calibri" w:cs="Calibri"/>
-        </w:rPr>
-        <w:t>🟡</w:t>
-      </w:r>
-      <w:r>
-        <w:t xml:space="preserve"> Medium</w:t>
-      </w:r>
-    </w:p>
-    <w:p>
-      <w:pPr>
-        <w:pStyle w:val="ListParagraph"/>
-      </w:pPr>
-      <w:r>
-        <w:tab/>
-      </w:r>
-      <w:r>
-        <w:tab/>
-      </w:r>
-    </w:p>
-    <w:p>
-      <w:pPr>
-        <w:pStyle w:val="Heading2"/>
-        <w:rPr>
-          <w:b/>
-        </w:rPr>
-      </w:pPr>
-      <w:r>
-        <w:rPr>
-          <w:b/>
-          <w:sz w:val="28"/>
-        </w:rPr>
-        <w:t>Pattern 6</w:t>
-      </w:r>
-      <w:r>
-        <w:rPr>
-          <w:b/>
-          <w:sz w:val="28"/>
-        </w:rPr>
-        <w:t xml:space="preserve"> —</w:t>
-      </w:r>
-      <w:r>
-        <w:rPr>
-          <w:b/>
-          <w:sz w:val="28"/>
-        </w:rPr>
-        <w:t xml:space="preserve"> Tree Views</w:t>
-      </w:r>
-    </w:p>
-    <w:p>
-      <w:pPr>
-        <w:pStyle w:val="ListParagraph"/>
-        <w:numPr>
-          <w:ilvl w:val="0"/>
-          <w:numId w:val="38"/>
-        </w:numPr>
-      </w:pPr>
-      <w:r>
-        <w:t>Left View of Binary Tree</w:t>
-      </w:r>
-      <w:r>
-        <w:tab/>
-      </w:r>
-      <w:proofErr w:type="spellStart"/>
-      <w:r>
-        <w:t>GeeksforGeeks</w:t>
-      </w:r>
-      <w:proofErr w:type="spellEnd"/>
-      <w:r>
-        <w:tab/>
-      </w:r>
-      <w:r>
-        <w:rPr>
-          <w:rFonts w:ascii="Calibri" w:hAnsi="Calibri" w:cs="Calibri"/>
-        </w:rPr>
-        <w:t>🟡</w:t>
-      </w:r>
-      <w:r>
-        <w:t xml:space="preserve"> Medium</w:t>
-      </w:r>
-    </w:p>
-    <w:p>
-      <w:pPr>
-        <w:pStyle w:val="ListParagraph"/>
-        <w:numPr>
-          <w:ilvl w:val="0"/>
-          <w:numId w:val="38"/>
-        </w:numPr>
-      </w:pPr>
-      <w:r>
-        <w:t>Binary Tree Right Side View (199)</w:t>
-      </w:r>
-      <w:r>
-        <w:tab/>
-      </w:r>
-      <w:proofErr w:type="spellStart"/>
-      <w:r>
-        <w:t>LeetCode</w:t>
-      </w:r>
-      <w:proofErr w:type="spellEnd"/>
-      <w:r>
-        <w:tab/>
-      </w:r>
-      <w:r>
-        <w:rPr>
-          <w:rFonts w:ascii="Calibri" w:hAnsi="Calibri" w:cs="Calibri"/>
-        </w:rPr>
-        <w:t>🟡</w:t>
-      </w:r>
-      <w:r>
-        <w:t xml:space="preserve"> Medium</w:t>
-      </w:r>
-    </w:p>
-    <w:p>
-      <w:pPr>
-        <w:pStyle w:val="ListParagraph"/>
-        <w:numPr>
-          <w:ilvl w:val="0"/>
-          <w:numId w:val="38"/>
-        </w:numPr>
-      </w:pPr>
-      <w:r>
-        <w:t>Vertical Order Traversal of a Binary Tree (987)</w:t>
-      </w:r>
-      <w:r>
-        <w:tab/>
-      </w:r>
-      <w:proofErr w:type="spellStart"/>
-      <w:r>
-        <w:t>LeetCode</w:t>
-      </w:r>
-      <w:proofErr w:type="spellEnd"/>
-      <w:r>
-        <w:tab/>
-      </w:r>
-      <w:r>
-        <w:rPr>
-          <w:rFonts w:ascii="Segoe UI Symbol" w:hAnsi="Segoe UI Symbol" w:cs="Segoe UI Symbol"/>
-        </w:rPr>
-        <w:t>🔴</w:t>
-      </w:r>
-      <w:r>
-        <w:t xml:space="preserve"> Hard</w:t>
-      </w:r>
-    </w:p>
-    <w:p>
-      <w:pPr>
-        <w:pStyle w:val="ListParagraph"/>
-        <w:numPr>
-          <w:ilvl w:val="0"/>
-          <w:numId w:val="38"/>
-        </w:numPr>
-      </w:pPr>
-      <w:r>
-        <w:t>Find Bottom Left Tree Value (513)</w:t>
-      </w:r>
-      <w:r>
-        <w:tab/>
-      </w:r>
-      <w:proofErr w:type="spellStart"/>
-      <w:r>
-        <w:t>LeetCode</w:t>
-      </w:r>
-      <w:proofErr w:type="spellEnd"/>
-      <w:r>
-        <w:tab/>
-      </w:r>
-      <w:r>
-        <w:rPr>
-          <w:rFonts w:ascii="Calibri" w:hAnsi="Calibri" w:cs="Calibri"/>
-        </w:rPr>
-        <w:t>🟡</w:t>
-      </w:r>
-      <w:r>
-        <w:t xml:space="preserve"> Medium</w:t>
-      </w:r>
-    </w:p>
-    <w:p>
-      <w:pPr>
-        <w:pStyle w:val="ListParagraph"/>
-        <w:numPr>
-          <w:ilvl w:val="0"/>
-          <w:numId w:val="38"/>
-        </w:numPr>
-      </w:pPr>
-      <w:r>
-        <w:t>Boundary Traversal of Binary Tree</w:t>
-      </w:r>
-      <w:r>
-        <w:tab/>
-      </w:r>
-      <w:proofErr w:type="spellStart"/>
-      <w:r>
-        <w:t>GeeksforGeeks</w:t>
-      </w:r>
-      <w:proofErr w:type="spellEnd"/>
-      <w:r>
-        <w:tab/>
-      </w:r>
-      <w:r>
-        <w:rPr>
-          <w:rFonts w:ascii="Calibri" w:hAnsi="Calibri" w:cs="Calibri"/>
-        </w:rPr>
-        <w:t>🟡</w:t>
-      </w:r>
-      <w:r>
-        <w:t xml:space="preserve"> Medium</w:t>
-      </w:r>
-    </w:p>
-    <w:p>
-      <w:pPr>
-        <w:pStyle w:val="ListParagraph"/>
-        <w:numPr>
-          <w:ilvl w:val="0"/>
-          <w:numId w:val="38"/>
-        </w:numPr>
-      </w:pPr>
-      <w:r>
-        <w:t>Top View of Binary Tree</w:t>
-      </w:r>
-      <w:r>
-        <w:tab/>
-      </w:r>
-      <w:proofErr w:type="spellStart"/>
-      <w:r>
-        <w:t>GeeksforGeeks</w:t>
-      </w:r>
-      <w:proofErr w:type="spellEnd"/>
-      <w:r>
-        <w:tab/>
-      </w:r>
-      <w:r>
-        <w:rPr>
-          <w:rFonts w:ascii="Calibri" w:hAnsi="Calibri" w:cs="Calibri"/>
-        </w:rPr>
-        <w:t>🟡</w:t>
-      </w:r>
-      <w:r>
-        <w:t xml:space="preserve"> Medium</w:t>
-      </w:r>
-    </w:p>
-    <w:p>
-      <w:pPr>
-        <w:pStyle w:val="ListParagraph"/>
-        <w:numPr>
-          <w:ilvl w:val="0"/>
-          <w:numId w:val="38"/>
-        </w:numPr>
-      </w:pPr>
-      <w:r>
-        <w:t>Bottom View of Binary Tree</w:t>
-      </w:r>
-      <w:r>
-        <w:tab/>
-      </w:r>
-      <w:proofErr w:type="spellStart"/>
-      <w:r>
-        <w:t>GeeksforGeeks</w:t>
-      </w:r>
-      <w:proofErr w:type="spellEnd"/>
-      <w:r>
-        <w:tab/>
-      </w:r>
-      <w:r>
-        <w:rPr>
-          <w:rFonts w:ascii="Calibri" w:hAnsi="Calibri" w:cs="Calibri"/>
-        </w:rPr>
-        <w:t>🟡</w:t>
-      </w:r>
-      <w:r>
-        <w:t xml:space="preserve"> Medium</w:t>
-      </w:r>
-    </w:p>
-    <w:p>
-      <w:pPr>
-        <w:pStyle w:val="ListParagraph"/>
+        <w:rPr>
+          <w:sz w:val="14"/>
+        </w:rPr>
       </w:pPr>
     </w:p>
     <w:p>
@@ -12857,6 +12819,10 @@
       </w:r>
     </w:p>
     <w:p/>
+    <w:p>
+      <w:bookmarkStart w:id="30" w:name="_GoBack"/>
+      <w:bookmarkEnd w:id="30"/>
+    </w:p>
     <w:p>
       <w:pPr>
         <w:pStyle w:val="Heading1"/>
@@ -53495,6 +53461,86 @@
         <w:spacing w:after="160" w:line="259" w:lineRule="auto"/>
       </w:pPr>
     </w:p>
+    <w:p>
+      <w:pPr>
+        <w:pStyle w:val="Header"/>
+        <w:tabs>
+          <w:tab w:val="clear" w:pos="4513"/>
+          <w:tab w:val="clear" w:pos="9026"/>
+        </w:tabs>
+        <w:spacing w:after="160" w:line="259" w:lineRule="auto"/>
+      </w:pPr>
+    </w:p>
+    <w:p>
+      <w:pPr>
+        <w:pStyle w:val="Header"/>
+        <w:tabs>
+          <w:tab w:val="clear" w:pos="4513"/>
+          <w:tab w:val="clear" w:pos="9026"/>
+        </w:tabs>
+        <w:spacing w:after="160" w:line="259" w:lineRule="auto"/>
+      </w:pPr>
+    </w:p>
+    <w:p>
+      <w:pPr>
+        <w:pStyle w:val="Header"/>
+        <w:tabs>
+          <w:tab w:val="clear" w:pos="4513"/>
+          <w:tab w:val="clear" w:pos="9026"/>
+        </w:tabs>
+        <w:spacing w:after="160" w:line="259" w:lineRule="auto"/>
+      </w:pPr>
+    </w:p>
+    <w:p>
+      <w:pPr>
+        <w:pStyle w:val="Header"/>
+        <w:tabs>
+          <w:tab w:val="clear" w:pos="4513"/>
+          <w:tab w:val="clear" w:pos="9026"/>
+        </w:tabs>
+        <w:spacing w:after="160" w:line="259" w:lineRule="auto"/>
+      </w:pPr>
+    </w:p>
+    <w:p>
+      <w:pPr>
+        <w:pStyle w:val="Header"/>
+        <w:tabs>
+          <w:tab w:val="clear" w:pos="4513"/>
+          <w:tab w:val="clear" w:pos="9026"/>
+        </w:tabs>
+        <w:spacing w:after="160" w:line="259" w:lineRule="auto"/>
+      </w:pPr>
+    </w:p>
+    <w:p>
+      <w:pPr>
+        <w:pStyle w:val="Header"/>
+        <w:tabs>
+          <w:tab w:val="clear" w:pos="4513"/>
+          <w:tab w:val="clear" w:pos="9026"/>
+        </w:tabs>
+        <w:spacing w:after="160" w:line="259" w:lineRule="auto"/>
+      </w:pPr>
+    </w:p>
+    <w:p>
+      <w:pPr>
+        <w:pStyle w:val="Header"/>
+        <w:tabs>
+          <w:tab w:val="clear" w:pos="4513"/>
+          <w:tab w:val="clear" w:pos="9026"/>
+        </w:tabs>
+        <w:spacing w:after="160" w:line="259" w:lineRule="auto"/>
+      </w:pPr>
+    </w:p>
+    <w:p>
+      <w:pPr>
+        <w:pStyle w:val="Header"/>
+        <w:tabs>
+          <w:tab w:val="clear" w:pos="4513"/>
+          <w:tab w:val="clear" w:pos="9026"/>
+        </w:tabs>
+        <w:spacing w:after="160" w:line="259" w:lineRule="auto"/>
+      </w:pPr>
+    </w:p>
     <w:sectPr>
       <w:footerReference w:type="default" r:id="rId39"/>
       <w:pgSz w:w="11906" w:h="16838" w:code="9"/>
@@ -53580,7 +53626,7 @@
         <w:noProof/>
         <w:color w:val="404040" w:themeColor="text1" w:themeTint="BF"/>
       </w:rPr>
-      <w:t>21</w:t>
+      <w:t>13</w:t>
     </w:r>
     <w:r>
       <w:rPr>
@@ -53715,6 +53761,119 @@
     </w:lvl>
   </w:abstractNum>
   <w:abstractNum w:abstractNumId="1" w15:restartNumberingAfterBreak="0">
+    <w:nsid w:val="0A033343"/>
+    <w:multiLevelType w:val="hybridMultilevel"/>
+    <w:tmpl w:val="95C40686"/>
+    <w:lvl w:ilvl="0" w:tplc="11D8DC96">
+      <w:numFmt w:val="bullet"/>
+      <w:lvlText w:val="-"/>
+      <w:lvlJc w:val="left"/>
+      <w:pPr>
+        <w:ind w:left="360" w:hanging="360"/>
+      </w:pPr>
+      <w:rPr>
+        <w:rFonts w:ascii="Segoe UI" w:eastAsiaTheme="minorHAnsi" w:hAnsi="Segoe UI" w:cs="Segoe UI" w:hint="default"/>
+        <w:sz w:val="21"/>
+      </w:rPr>
+    </w:lvl>
+    <w:lvl w:ilvl="1" w:tplc="40090003">
+      <w:start w:val="1"/>
+      <w:numFmt w:val="bullet"/>
+      <w:lvlText w:val="o"/>
+      <w:lvlJc w:val="left"/>
+      <w:pPr>
+        <w:ind w:left="360" w:hanging="360"/>
+      </w:pPr>
+      <w:rPr>
+        <w:rFonts w:ascii="Courier New" w:hAnsi="Courier New" w:cs="Courier New" w:hint="default"/>
+      </w:rPr>
+    </w:lvl>
+    <w:lvl w:ilvl="2" w:tplc="40090005" w:tentative="1">
+      <w:start w:val="1"/>
+      <w:numFmt w:val="bullet"/>
+      <w:lvlText w:val=""/>
+      <w:lvlJc w:val="left"/>
+      <w:pPr>
+        <w:ind w:left="1080" w:hanging="360"/>
+      </w:pPr>
+      <w:rPr>
+        <w:rFonts w:ascii="Wingdings" w:hAnsi="Wingdings" w:hint="default"/>
+      </w:rPr>
+    </w:lvl>
+    <w:lvl w:ilvl="3" w:tplc="40090001" w:tentative="1">
+      <w:start w:val="1"/>
+      <w:numFmt w:val="bullet"/>
+      <w:lvlText w:val=""/>
+      <w:lvlJc w:val="left"/>
+      <w:pPr>
+        <w:ind w:left="1800" w:hanging="360"/>
+      </w:pPr>
+      <w:rPr>
+        <w:rFonts w:ascii="Symbol" w:hAnsi="Symbol" w:hint="default"/>
+      </w:rPr>
+    </w:lvl>
+    <w:lvl w:ilvl="4" w:tplc="40090003" w:tentative="1">
+      <w:start w:val="1"/>
+      <w:numFmt w:val="bullet"/>
+      <w:lvlText w:val="o"/>
+      <w:lvlJc w:val="left"/>
+      <w:pPr>
+        <w:ind w:left="2520" w:hanging="360"/>
+      </w:pPr>
+      <w:rPr>
+        <w:rFonts w:ascii="Courier New" w:hAnsi="Courier New" w:cs="Courier New" w:hint="default"/>
+      </w:rPr>
+    </w:lvl>
+    <w:lvl w:ilvl="5" w:tplc="40090005" w:tentative="1">
+      <w:start w:val="1"/>
+      <w:numFmt w:val="bullet"/>
+      <w:lvlText w:val=""/>
+      <w:lvlJc w:val="left"/>
+      <w:pPr>
+        <w:ind w:left="3240" w:hanging="360"/>
+      </w:pPr>
+      <w:rPr>
+        <w:rFonts w:ascii="Wingdings" w:hAnsi="Wingdings" w:hint="default"/>
+      </w:rPr>
+    </w:lvl>
+    <w:lvl w:ilvl="6" w:tplc="40090001" w:tentative="1">
+      <w:start w:val="1"/>
+      <w:numFmt w:val="bullet"/>
+      <w:lvlText w:val=""/>
+      <w:lvlJc w:val="left"/>
+      <w:pPr>
+        <w:ind w:left="3960" w:hanging="360"/>
+      </w:pPr>
+      <w:rPr>
+        <w:rFonts w:ascii="Symbol" w:hAnsi="Symbol" w:hint="default"/>
+      </w:rPr>
+    </w:lvl>
+    <w:lvl w:ilvl="7" w:tplc="40090003" w:tentative="1">
+      <w:start w:val="1"/>
+      <w:numFmt w:val="bullet"/>
+      <w:lvlText w:val="o"/>
+      <w:lvlJc w:val="left"/>
+      <w:pPr>
+        <w:ind w:left="4680" w:hanging="360"/>
+      </w:pPr>
+      <w:rPr>
+        <w:rFonts w:ascii="Courier New" w:hAnsi="Courier New" w:cs="Courier New" w:hint="default"/>
+      </w:rPr>
+    </w:lvl>
+    <w:lvl w:ilvl="8" w:tplc="40090005" w:tentative="1">
+      <w:start w:val="1"/>
+      <w:numFmt w:val="bullet"/>
+      <w:lvlText w:val=""/>
+      <w:lvlJc w:val="left"/>
+      <w:pPr>
+        <w:ind w:left="5400" w:hanging="360"/>
+      </w:pPr>
+      <w:rPr>
+        <w:rFonts w:ascii="Wingdings" w:hAnsi="Wingdings" w:hint="default"/>
+      </w:rPr>
+    </w:lvl>
+  </w:abstractNum>
+  <w:abstractNum w:abstractNumId="2" w15:restartNumberingAfterBreak="0">
     <w:nsid w:val="0C6E1B3C"/>
     <w:multiLevelType w:val="hybridMultilevel"/>
     <w:tmpl w:val="6630B26C"/>
@@ -53803,7 +53962,7 @@
       </w:pPr>
     </w:lvl>
   </w:abstractNum>
-  <w:abstractNum w:abstractNumId="2" w15:restartNumberingAfterBreak="0">
+  <w:abstractNum w:abstractNumId="3" w15:restartNumberingAfterBreak="0">
     <w:nsid w:val="0DA92CB3"/>
     <w:multiLevelType w:val="hybridMultilevel"/>
     <w:tmpl w:val="A754DCC2"/>
@@ -53892,7 +54051,7 @@
       </w:pPr>
     </w:lvl>
   </w:abstractNum>
-  <w:abstractNum w:abstractNumId="3" w15:restartNumberingAfterBreak="0">
+  <w:abstractNum w:abstractNumId="4" w15:restartNumberingAfterBreak="0">
     <w:nsid w:val="12B671E8"/>
     <w:multiLevelType w:val="hybridMultilevel"/>
     <w:tmpl w:val="4E3A8F9A"/>
@@ -53981,10 +54140,10 @@
       </w:pPr>
     </w:lvl>
   </w:abstractNum>
-  <w:abstractNum w:abstractNumId="4" w15:restartNumberingAfterBreak="0">
+  <w:abstractNum w:abstractNumId="5" w15:restartNumberingAfterBreak="0">
     <w:nsid w:val="13A0144A"/>
     <w:multiLevelType w:val="hybridMultilevel"/>
-    <w:tmpl w:val="351607E2"/>
+    <w:tmpl w:val="80C46DA0"/>
     <w:lvl w:ilvl="0" w:tplc="4009000F">
       <w:start w:val="1"/>
       <w:numFmt w:val="decimal"/>
@@ -53994,14 +54153,17 @@
         <w:ind w:left="720" w:hanging="360"/>
       </w:pPr>
     </w:lvl>
-    <w:lvl w:ilvl="1" w:tplc="40090019" w:tentative="1">
-      <w:start w:val="1"/>
-      <w:numFmt w:val="lowerLetter"/>
-      <w:lvlText w:val="%2."/>
+    <w:lvl w:ilvl="1" w:tplc="11D8DC96">
+      <w:numFmt w:val="bullet"/>
+      <w:lvlText w:val="-"/>
       <w:lvlJc w:val="left"/>
       <w:pPr>
         <w:ind w:left="1440" w:hanging="360"/>
       </w:pPr>
+      <w:rPr>
+        <w:rFonts w:ascii="Segoe UI" w:eastAsiaTheme="minorHAnsi" w:hAnsi="Segoe UI" w:cs="Segoe UI" w:hint="default"/>
+        <w:sz w:val="21"/>
+      </w:rPr>
     </w:lvl>
     <w:lvl w:ilvl="2" w:tplc="4009001B" w:tentative="1">
       <w:start w:val="1"/>
@@ -54067,7 +54229,7 @@
       </w:pPr>
     </w:lvl>
   </w:abstractNum>
-  <w:abstractNum w:abstractNumId="5" w15:restartNumberingAfterBreak="0">
+  <w:abstractNum w:abstractNumId="6" w15:restartNumberingAfterBreak="0">
     <w:nsid w:val="15022F0E"/>
     <w:multiLevelType w:val="hybridMultilevel"/>
     <w:tmpl w:val="B8C02A7A"/>
@@ -54153,7 +54315,7 @@
       </w:pPr>
     </w:lvl>
   </w:abstractNum>
-  <w:abstractNum w:abstractNumId="6" w15:restartNumberingAfterBreak="0">
+  <w:abstractNum w:abstractNumId="7" w15:restartNumberingAfterBreak="0">
     <w:nsid w:val="150D48C9"/>
     <w:multiLevelType w:val="hybridMultilevel"/>
     <w:tmpl w:val="0F1E6354"/>
@@ -54239,7 +54401,7 @@
       </w:pPr>
     </w:lvl>
   </w:abstractNum>
-  <w:abstractNum w:abstractNumId="7" w15:restartNumberingAfterBreak="0">
+  <w:abstractNum w:abstractNumId="8" w15:restartNumberingAfterBreak="0">
     <w:nsid w:val="16F43E2F"/>
     <w:multiLevelType w:val="hybridMultilevel"/>
     <w:tmpl w:val="10B41CCE"/>
@@ -54328,7 +54490,234 @@
       </w:pPr>
     </w:lvl>
   </w:abstractNum>
-  <w:abstractNum w:abstractNumId="8" w15:restartNumberingAfterBreak="0">
+  <w:abstractNum w:abstractNumId="9" w15:restartNumberingAfterBreak="0">
+    <w:nsid w:val="17D44B62"/>
+    <w:multiLevelType w:val="hybridMultilevel"/>
+    <w:tmpl w:val="55A2BEDC"/>
+    <w:lvl w:ilvl="0" w:tplc="11D8DC96">
+      <w:numFmt w:val="bullet"/>
+      <w:lvlText w:val="-"/>
+      <w:lvlJc w:val="left"/>
+      <w:pPr>
+        <w:ind w:left="1440" w:hanging="360"/>
+      </w:pPr>
+      <w:rPr>
+        <w:rFonts w:ascii="Segoe UI" w:eastAsiaTheme="minorHAnsi" w:hAnsi="Segoe UI" w:cs="Segoe UI" w:hint="default"/>
+        <w:sz w:val="21"/>
+      </w:rPr>
+    </w:lvl>
+    <w:lvl w:ilvl="1" w:tplc="40090003" w:tentative="1">
+      <w:start w:val="1"/>
+      <w:numFmt w:val="bullet"/>
+      <w:lvlText w:val="o"/>
+      <w:lvlJc w:val="left"/>
+      <w:pPr>
+        <w:ind w:left="1440" w:hanging="360"/>
+      </w:pPr>
+      <w:rPr>
+        <w:rFonts w:ascii="Courier New" w:hAnsi="Courier New" w:cs="Courier New" w:hint="default"/>
+      </w:rPr>
+    </w:lvl>
+    <w:lvl w:ilvl="2" w:tplc="40090005" w:tentative="1">
+      <w:start w:val="1"/>
+      <w:numFmt w:val="bullet"/>
+      <w:lvlText w:val=""/>
+      <w:lvlJc w:val="left"/>
+      <w:pPr>
+        <w:ind w:left="2160" w:hanging="360"/>
+      </w:pPr>
+      <w:rPr>
+        <w:rFonts w:ascii="Wingdings" w:hAnsi="Wingdings" w:hint="default"/>
+      </w:rPr>
+    </w:lvl>
+    <w:lvl w:ilvl="3" w:tplc="40090001" w:tentative="1">
+      <w:start w:val="1"/>
+      <w:numFmt w:val="bullet"/>
+      <w:lvlText w:val=""/>
+      <w:lvlJc w:val="left"/>
+      <w:pPr>
+        <w:ind w:left="2880" w:hanging="360"/>
+      </w:pPr>
+      <w:rPr>
+        <w:rFonts w:ascii="Symbol" w:hAnsi="Symbol" w:hint="default"/>
+      </w:rPr>
+    </w:lvl>
+    <w:lvl w:ilvl="4" w:tplc="40090003" w:tentative="1">
+      <w:start w:val="1"/>
+      <w:numFmt w:val="bullet"/>
+      <w:lvlText w:val="o"/>
+      <w:lvlJc w:val="left"/>
+      <w:pPr>
+        <w:ind w:left="3600" w:hanging="360"/>
+      </w:pPr>
+      <w:rPr>
+        <w:rFonts w:ascii="Courier New" w:hAnsi="Courier New" w:cs="Courier New" w:hint="default"/>
+      </w:rPr>
+    </w:lvl>
+    <w:lvl w:ilvl="5" w:tplc="40090005" w:tentative="1">
+      <w:start w:val="1"/>
+      <w:numFmt w:val="bullet"/>
+      <w:lvlText w:val=""/>
+      <w:lvlJc w:val="left"/>
+      <w:pPr>
+        <w:ind w:left="4320" w:hanging="360"/>
+      </w:pPr>
+      <w:rPr>
+        <w:rFonts w:ascii="Wingdings" w:hAnsi="Wingdings" w:hint="default"/>
+      </w:rPr>
+    </w:lvl>
+    <w:lvl w:ilvl="6" w:tplc="40090001" w:tentative="1">
+      <w:start w:val="1"/>
+      <w:numFmt w:val="bullet"/>
+      <w:lvlText w:val=""/>
+      <w:lvlJc w:val="left"/>
+      <w:pPr>
+        <w:ind w:left="5040" w:hanging="360"/>
+      </w:pPr>
+      <w:rPr>
+        <w:rFonts w:ascii="Symbol" w:hAnsi="Symbol" w:hint="default"/>
+      </w:rPr>
+    </w:lvl>
+    <w:lvl w:ilvl="7" w:tplc="40090003" w:tentative="1">
+      <w:start w:val="1"/>
+      <w:numFmt w:val="bullet"/>
+      <w:lvlText w:val="o"/>
+      <w:lvlJc w:val="left"/>
+      <w:pPr>
+        <w:ind w:left="5760" w:hanging="360"/>
+      </w:pPr>
+      <w:rPr>
+        <w:rFonts w:ascii="Courier New" w:hAnsi="Courier New" w:cs="Courier New" w:hint="default"/>
+      </w:rPr>
+    </w:lvl>
+    <w:lvl w:ilvl="8" w:tplc="40090005" w:tentative="1">
+      <w:start w:val="1"/>
+      <w:numFmt w:val="bullet"/>
+      <w:lvlText w:val=""/>
+      <w:lvlJc w:val="left"/>
+      <w:pPr>
+        <w:ind w:left="6480" w:hanging="360"/>
+      </w:pPr>
+      <w:rPr>
+        <w:rFonts w:ascii="Wingdings" w:hAnsi="Wingdings" w:hint="default"/>
+      </w:rPr>
+    </w:lvl>
+  </w:abstractNum>
+  <w:abstractNum w:abstractNumId="10" w15:restartNumberingAfterBreak="0">
+    <w:nsid w:val="28C432C7"/>
+    <w:multiLevelType w:val="hybridMultilevel"/>
+    <w:tmpl w:val="8F789786"/>
+    <w:lvl w:ilvl="0" w:tplc="40090001">
+      <w:start w:val="1"/>
+      <w:numFmt w:val="bullet"/>
+      <w:lvlText w:val=""/>
+      <w:lvlJc w:val="left"/>
+      <w:pPr>
+        <w:ind w:left="360" w:hanging="360"/>
+      </w:pPr>
+      <w:rPr>
+        <w:rFonts w:ascii="Symbol" w:hAnsi="Symbol" w:hint="default"/>
+        <w:sz w:val="21"/>
+      </w:rPr>
+    </w:lvl>
+    <w:lvl w:ilvl="1" w:tplc="40090003" w:tentative="1">
+      <w:start w:val="1"/>
+      <w:numFmt w:val="bullet"/>
+      <w:lvlText w:val="o"/>
+      <w:lvlJc w:val="left"/>
+      <w:pPr>
+        <w:ind w:left="360" w:hanging="360"/>
+      </w:pPr>
+      <w:rPr>
+        <w:rFonts w:ascii="Courier New" w:hAnsi="Courier New" w:cs="Courier New" w:hint="default"/>
+      </w:rPr>
+    </w:lvl>
+    <w:lvl w:ilvl="2" w:tplc="40090005" w:tentative="1">
+      <w:start w:val="1"/>
+      <w:numFmt w:val="bullet"/>
+      <w:lvlText w:val=""/>
+      <w:lvlJc w:val="left"/>
+      <w:pPr>
+        <w:ind w:left="1080" w:hanging="360"/>
+      </w:pPr>
+      <w:rPr>
+        <w:rFonts w:ascii="Wingdings" w:hAnsi="Wingdings" w:hint="default"/>
+      </w:rPr>
+    </w:lvl>
+    <w:lvl w:ilvl="3" w:tplc="40090001" w:tentative="1">
+      <w:start w:val="1"/>
+      <w:numFmt w:val="bullet"/>
+      <w:lvlText w:val=""/>
+      <w:lvlJc w:val="left"/>
+      <w:pPr>
+        <w:ind w:left="1800" w:hanging="360"/>
+      </w:pPr>
+      <w:rPr>
+        <w:rFonts w:ascii="Symbol" w:hAnsi="Symbol" w:hint="default"/>
+      </w:rPr>
+    </w:lvl>
+    <w:lvl w:ilvl="4" w:tplc="40090003" w:tentative="1">
+      <w:start w:val="1"/>
+      <w:numFmt w:val="bullet"/>
+      <w:lvlText w:val="o"/>
+      <w:lvlJc w:val="left"/>
+      <w:pPr>
+        <w:ind w:left="2520" w:hanging="360"/>
+      </w:pPr>
+      <w:rPr>
+        <w:rFonts w:ascii="Courier New" w:hAnsi="Courier New" w:cs="Courier New" w:hint="default"/>
+      </w:rPr>
+    </w:lvl>
+    <w:lvl w:ilvl="5" w:tplc="40090005" w:tentative="1">
+      <w:start w:val="1"/>
+      <w:numFmt w:val="bullet"/>
+      <w:lvlText w:val=""/>
+      <w:lvlJc w:val="left"/>
+      <w:pPr>
+        <w:ind w:left="3240" w:hanging="360"/>
+      </w:pPr>
+      <w:rPr>
+        <w:rFonts w:ascii="Wingdings" w:hAnsi="Wingdings" w:hint="default"/>
+      </w:rPr>
+    </w:lvl>
+    <w:lvl w:ilvl="6" w:tplc="40090001" w:tentative="1">
+      <w:start w:val="1"/>
+      <w:numFmt w:val="bullet"/>
+      <w:lvlText w:val=""/>
+      <w:lvlJc w:val="left"/>
+      <w:pPr>
+        <w:ind w:left="3960" w:hanging="360"/>
+      </w:pPr>
+      <w:rPr>
+        <w:rFonts w:ascii="Symbol" w:hAnsi="Symbol" w:hint="default"/>
+      </w:rPr>
+    </w:lvl>
+    <w:lvl w:ilvl="7" w:tplc="40090003" w:tentative="1">
+      <w:start w:val="1"/>
+      <w:numFmt w:val="bullet"/>
+      <w:lvlText w:val="o"/>
+      <w:lvlJc w:val="left"/>
+      <w:pPr>
+        <w:ind w:left="4680" w:hanging="360"/>
+      </w:pPr>
+      <w:rPr>
+        <w:rFonts w:ascii="Courier New" w:hAnsi="Courier New" w:cs="Courier New" w:hint="default"/>
+      </w:rPr>
+    </w:lvl>
+    <w:lvl w:ilvl="8" w:tplc="40090005" w:tentative="1">
+      <w:start w:val="1"/>
+      <w:numFmt w:val="bullet"/>
+      <w:lvlText w:val=""/>
+      <w:lvlJc w:val="left"/>
+      <w:pPr>
+        <w:ind w:left="5400" w:hanging="360"/>
+      </w:pPr>
+      <w:rPr>
+        <w:rFonts w:ascii="Wingdings" w:hAnsi="Wingdings" w:hint="default"/>
+      </w:rPr>
+    </w:lvl>
+  </w:abstractNum>
+  <w:abstractNum w:abstractNumId="11" w15:restartNumberingAfterBreak="0">
     <w:nsid w:val="2C0B5455"/>
     <w:multiLevelType w:val="hybridMultilevel"/>
     <w:tmpl w:val="2300FA1A"/>
@@ -54414,7 +54803,7 @@
       </w:pPr>
     </w:lvl>
   </w:abstractNum>
-  <w:abstractNum w:abstractNumId="9" w15:restartNumberingAfterBreak="0">
+  <w:abstractNum w:abstractNumId="12" w15:restartNumberingAfterBreak="0">
     <w:nsid w:val="372F3897"/>
     <w:multiLevelType w:val="hybridMultilevel"/>
     <w:tmpl w:val="67245D32"/>
@@ -54500,7 +54889,7 @@
       </w:pPr>
     </w:lvl>
   </w:abstractNum>
-  <w:abstractNum w:abstractNumId="10" w15:restartNumberingAfterBreak="0">
+  <w:abstractNum w:abstractNumId="13" w15:restartNumberingAfterBreak="0">
     <w:nsid w:val="3B3C2ACC"/>
     <w:multiLevelType w:val="hybridMultilevel"/>
     <w:tmpl w:val="D69CAC4C"/>
@@ -54589,7 +54978,7 @@
       </w:pPr>
     </w:lvl>
   </w:abstractNum>
-  <w:abstractNum w:abstractNumId="11" w15:restartNumberingAfterBreak="0">
+  <w:abstractNum w:abstractNumId="14" w15:restartNumberingAfterBreak="0">
     <w:nsid w:val="42F91543"/>
     <w:multiLevelType w:val="hybridMultilevel"/>
     <w:tmpl w:val="A600E434"/>
@@ -54675,7 +55064,120 @@
       </w:pPr>
     </w:lvl>
   </w:abstractNum>
-  <w:abstractNum w:abstractNumId="12" w15:restartNumberingAfterBreak="0">
+  <w:abstractNum w:abstractNumId="15" w15:restartNumberingAfterBreak="0">
+    <w:nsid w:val="444C598F"/>
+    <w:multiLevelType w:val="hybridMultilevel"/>
+    <w:tmpl w:val="3518309C"/>
+    <w:lvl w:ilvl="0" w:tplc="11D8DC96">
+      <w:numFmt w:val="bullet"/>
+      <w:lvlText w:val="-"/>
+      <w:lvlJc w:val="left"/>
+      <w:pPr>
+        <w:ind w:left="1440" w:hanging="360"/>
+      </w:pPr>
+      <w:rPr>
+        <w:rFonts w:ascii="Segoe UI" w:eastAsiaTheme="minorHAnsi" w:hAnsi="Segoe UI" w:cs="Segoe UI" w:hint="default"/>
+        <w:sz w:val="21"/>
+      </w:rPr>
+    </w:lvl>
+    <w:lvl w:ilvl="1" w:tplc="40090003">
+      <w:start w:val="1"/>
+      <w:numFmt w:val="bullet"/>
+      <w:lvlText w:val="o"/>
+      <w:lvlJc w:val="left"/>
+      <w:pPr>
+        <w:ind w:left="1440" w:hanging="360"/>
+      </w:pPr>
+      <w:rPr>
+        <w:rFonts w:ascii="Courier New" w:hAnsi="Courier New" w:cs="Courier New" w:hint="default"/>
+      </w:rPr>
+    </w:lvl>
+    <w:lvl w:ilvl="2" w:tplc="40090005" w:tentative="1">
+      <w:start w:val="1"/>
+      <w:numFmt w:val="bullet"/>
+      <w:lvlText w:val=""/>
+      <w:lvlJc w:val="left"/>
+      <w:pPr>
+        <w:ind w:left="2160" w:hanging="360"/>
+      </w:pPr>
+      <w:rPr>
+        <w:rFonts w:ascii="Wingdings" w:hAnsi="Wingdings" w:hint="default"/>
+      </w:rPr>
+    </w:lvl>
+    <w:lvl w:ilvl="3" w:tplc="40090001" w:tentative="1">
+      <w:start w:val="1"/>
+      <w:numFmt w:val="bullet"/>
+      <w:lvlText w:val=""/>
+      <w:lvlJc w:val="left"/>
+      <w:pPr>
+        <w:ind w:left="2880" w:hanging="360"/>
+      </w:pPr>
+      <w:rPr>
+        <w:rFonts w:ascii="Symbol" w:hAnsi="Symbol" w:hint="default"/>
+      </w:rPr>
+    </w:lvl>
+    <w:lvl w:ilvl="4" w:tplc="40090003" w:tentative="1">
+      <w:start w:val="1"/>
+      <w:numFmt w:val="bullet"/>
+      <w:lvlText w:val="o"/>
+      <w:lvlJc w:val="left"/>
+      <w:pPr>
+        <w:ind w:left="3600" w:hanging="360"/>
+      </w:pPr>
+      <w:rPr>
+        <w:rFonts w:ascii="Courier New" w:hAnsi="Courier New" w:cs="Courier New" w:hint="default"/>
+      </w:rPr>
+    </w:lvl>
+    <w:lvl w:ilvl="5" w:tplc="40090005" w:tentative="1">
+      <w:start w:val="1"/>
+      <w:numFmt w:val="bullet"/>
+      <w:lvlText w:val=""/>
+      <w:lvlJc w:val="left"/>
+      <w:pPr>
+        <w:ind w:left="4320" w:hanging="360"/>
+      </w:pPr>
+      <w:rPr>
+        <w:rFonts w:ascii="Wingdings" w:hAnsi="Wingdings" w:hint="default"/>
+      </w:rPr>
+    </w:lvl>
+    <w:lvl w:ilvl="6" w:tplc="40090001" w:tentative="1">
+      <w:start w:val="1"/>
+      <w:numFmt w:val="bullet"/>
+      <w:lvlText w:val=""/>
+      <w:lvlJc w:val="left"/>
+      <w:pPr>
+        <w:ind w:left="5040" w:hanging="360"/>
+      </w:pPr>
+      <w:rPr>
+        <w:rFonts w:ascii="Symbol" w:hAnsi="Symbol" w:hint="default"/>
+      </w:rPr>
+    </w:lvl>
+    <w:lvl w:ilvl="7" w:tplc="40090003" w:tentative="1">
+      <w:start w:val="1"/>
+      <w:numFmt w:val="bullet"/>
+      <w:lvlText w:val="o"/>
+      <w:lvlJc w:val="left"/>
+      <w:pPr>
+        <w:ind w:left="5760" w:hanging="360"/>
+      </w:pPr>
+      <w:rPr>
+        <w:rFonts w:ascii="Courier New" w:hAnsi="Courier New" w:cs="Courier New" w:hint="default"/>
+      </w:rPr>
+    </w:lvl>
+    <w:lvl w:ilvl="8" w:tplc="40090005" w:tentative="1">
+      <w:start w:val="1"/>
+      <w:numFmt w:val="bullet"/>
+      <w:lvlText w:val=""/>
+      <w:lvlJc w:val="left"/>
+      <w:pPr>
+        <w:ind w:left="6480" w:hanging="360"/>
+      </w:pPr>
+      <w:rPr>
+        <w:rFonts w:ascii="Wingdings" w:hAnsi="Wingdings" w:hint="default"/>
+      </w:rPr>
+    </w:lvl>
+  </w:abstractNum>
+  <w:abstractNum w:abstractNumId="16" w15:restartNumberingAfterBreak="0">
     <w:nsid w:val="44A7029E"/>
     <w:multiLevelType w:val="hybridMultilevel"/>
     <w:tmpl w:val="2DEE5DF8"/>
@@ -54788,7 +55290,7 @@
       </w:rPr>
     </w:lvl>
   </w:abstractNum>
-  <w:abstractNum w:abstractNumId="13" w15:restartNumberingAfterBreak="0">
+  <w:abstractNum w:abstractNumId="17" w15:restartNumberingAfterBreak="0">
     <w:nsid w:val="45935015"/>
     <w:multiLevelType w:val="hybridMultilevel"/>
     <w:tmpl w:val="33BC21C6"/>
@@ -54877,7 +55379,7 @@
       </w:pPr>
     </w:lvl>
   </w:abstractNum>
-  <w:abstractNum w:abstractNumId="14" w15:restartNumberingAfterBreak="0">
+  <w:abstractNum w:abstractNumId="18" w15:restartNumberingAfterBreak="0">
     <w:nsid w:val="476B18A5"/>
     <w:multiLevelType w:val="hybridMultilevel"/>
     <w:tmpl w:val="5C582974"/>
@@ -54963,7 +55465,7 @@
       </w:pPr>
     </w:lvl>
   </w:abstractNum>
-  <w:abstractNum w:abstractNumId="15" w15:restartNumberingAfterBreak="0">
+  <w:abstractNum w:abstractNumId="19" w15:restartNumberingAfterBreak="0">
     <w:nsid w:val="478F7626"/>
     <w:multiLevelType w:val="hybridMultilevel"/>
     <w:tmpl w:val="F2B013D4"/>
@@ -55052,7 +55554,7 @@
       </w:pPr>
     </w:lvl>
   </w:abstractNum>
-  <w:abstractNum w:abstractNumId="16" w15:restartNumberingAfterBreak="0">
+  <w:abstractNum w:abstractNumId="20" w15:restartNumberingAfterBreak="0">
     <w:nsid w:val="480070E4"/>
     <w:multiLevelType w:val="hybridMultilevel"/>
     <w:tmpl w:val="D69CAC4C"/>
@@ -55141,7 +55643,7 @@
       </w:pPr>
     </w:lvl>
   </w:abstractNum>
-  <w:abstractNum w:abstractNumId="17" w15:restartNumberingAfterBreak="0">
+  <w:abstractNum w:abstractNumId="21" w15:restartNumberingAfterBreak="0">
     <w:nsid w:val="4A6F4E4B"/>
     <w:multiLevelType w:val="hybridMultilevel"/>
     <w:tmpl w:val="4E3A8F9A"/>
@@ -55230,7 +55732,7 @@
       </w:pPr>
     </w:lvl>
   </w:abstractNum>
-  <w:abstractNum w:abstractNumId="18" w15:restartNumberingAfterBreak="0">
+  <w:abstractNum w:abstractNumId="22" w15:restartNumberingAfterBreak="0">
     <w:nsid w:val="50D2545E"/>
     <w:multiLevelType w:val="hybridMultilevel"/>
     <w:tmpl w:val="449EF488"/>
@@ -55316,7 +55818,7 @@
       </w:pPr>
     </w:lvl>
   </w:abstractNum>
-  <w:abstractNum w:abstractNumId="19" w15:restartNumberingAfterBreak="0">
+  <w:abstractNum w:abstractNumId="23" w15:restartNumberingAfterBreak="0">
     <w:nsid w:val="51C367B2"/>
     <w:multiLevelType w:val="hybridMultilevel"/>
     <w:tmpl w:val="B734E462"/>
@@ -55402,7 +55904,7 @@
       </w:pPr>
     </w:lvl>
   </w:abstractNum>
-  <w:abstractNum w:abstractNumId="20" w15:restartNumberingAfterBreak="0">
+  <w:abstractNum w:abstractNumId="24" w15:restartNumberingAfterBreak="0">
     <w:nsid w:val="540F1161"/>
     <w:multiLevelType w:val="hybridMultilevel"/>
     <w:tmpl w:val="33BC21C6"/>
@@ -55491,7 +55993,7 @@
       </w:pPr>
     </w:lvl>
   </w:abstractNum>
-  <w:abstractNum w:abstractNumId="21" w15:restartNumberingAfterBreak="0">
+  <w:abstractNum w:abstractNumId="25" w15:restartNumberingAfterBreak="0">
     <w:nsid w:val="577A1FFB"/>
     <w:multiLevelType w:val="hybridMultilevel"/>
     <w:tmpl w:val="946EDB54"/>
@@ -55580,7 +56082,7 @@
       </w:pPr>
     </w:lvl>
   </w:abstractNum>
-  <w:abstractNum w:abstractNumId="22" w15:restartNumberingAfterBreak="0">
+  <w:abstractNum w:abstractNumId="26" w15:restartNumberingAfterBreak="0">
     <w:nsid w:val="59BB1990"/>
     <w:multiLevelType w:val="hybridMultilevel"/>
     <w:tmpl w:val="B56C859E"/>
@@ -55693,7 +56195,7 @@
       </w:rPr>
     </w:lvl>
   </w:abstractNum>
-  <w:abstractNum w:abstractNumId="23" w15:restartNumberingAfterBreak="0">
+  <w:abstractNum w:abstractNumId="27" w15:restartNumberingAfterBreak="0">
     <w:nsid w:val="59F96816"/>
     <w:multiLevelType w:val="hybridMultilevel"/>
     <w:tmpl w:val="B56A124A"/>
@@ -55779,7 +56281,7 @@
       </w:pPr>
     </w:lvl>
   </w:abstractNum>
-  <w:abstractNum w:abstractNumId="24" w15:restartNumberingAfterBreak="0">
+  <w:abstractNum w:abstractNumId="28" w15:restartNumberingAfterBreak="0">
     <w:nsid w:val="5D357486"/>
     <w:multiLevelType w:val="hybridMultilevel"/>
     <w:tmpl w:val="FDB4669A"/>
@@ -55865,7 +56367,7 @@
       </w:pPr>
     </w:lvl>
   </w:abstractNum>
-  <w:abstractNum w:abstractNumId="25" w15:restartNumberingAfterBreak="0">
+  <w:abstractNum w:abstractNumId="29" w15:restartNumberingAfterBreak="0">
     <w:nsid w:val="5EC91099"/>
     <w:multiLevelType w:val="hybridMultilevel"/>
     <w:tmpl w:val="F98E3F94"/>
@@ -55954,11 +56456,11 @@
       </w:pPr>
     </w:lvl>
   </w:abstractNum>
-  <w:abstractNum w:abstractNumId="26" w15:restartNumberingAfterBreak="0">
+  <w:abstractNum w:abstractNumId="30" w15:restartNumberingAfterBreak="0">
     <w:nsid w:val="60BD0027"/>
     <w:multiLevelType w:val="hybridMultilevel"/>
-    <w:tmpl w:val="584CDE1E"/>
-    <w:lvl w:ilvl="0" w:tplc="40090001">
+    <w:tmpl w:val="7D14DF5E"/>
+    <w:lvl w:ilvl="0" w:tplc="C40EF2BE">
       <w:start w:val="1"/>
       <w:numFmt w:val="bullet"/>
       <w:lvlText w:val=""/>
@@ -55968,6 +56470,7 @@
       </w:pPr>
       <w:rPr>
         <w:rFonts w:ascii="Symbol" w:hAnsi="Symbol" w:hint="default"/>
+        <w:sz w:val="44"/>
       </w:rPr>
     </w:lvl>
     <w:lvl w:ilvl="1" w:tplc="40090003" w:tentative="1">
@@ -56067,7 +56570,7 @@
       </w:rPr>
     </w:lvl>
   </w:abstractNum>
-  <w:abstractNum w:abstractNumId="27" w15:restartNumberingAfterBreak="0">
+  <w:abstractNum w:abstractNumId="31" w15:restartNumberingAfterBreak="0">
     <w:nsid w:val="60DC30A4"/>
     <w:multiLevelType w:val="hybridMultilevel"/>
     <w:tmpl w:val="065AF348"/>
@@ -56156,7 +56659,7 @@
       </w:pPr>
     </w:lvl>
   </w:abstractNum>
-  <w:abstractNum w:abstractNumId="28" w15:restartNumberingAfterBreak="0">
+  <w:abstractNum w:abstractNumId="32" w15:restartNumberingAfterBreak="0">
     <w:nsid w:val="60FF55F5"/>
     <w:multiLevelType w:val="hybridMultilevel"/>
     <w:tmpl w:val="DB4A4456"/>
@@ -56242,7 +56745,7 @@
       </w:pPr>
     </w:lvl>
   </w:abstractNum>
-  <w:abstractNum w:abstractNumId="29" w15:restartNumberingAfterBreak="0">
+  <w:abstractNum w:abstractNumId="33" w15:restartNumberingAfterBreak="0">
     <w:nsid w:val="62B32FF9"/>
     <w:multiLevelType w:val="hybridMultilevel"/>
     <w:tmpl w:val="4E3A8F9A"/>
@@ -56331,7 +56834,7 @@
       </w:pPr>
     </w:lvl>
   </w:abstractNum>
-  <w:abstractNum w:abstractNumId="30" w15:restartNumberingAfterBreak="0">
+  <w:abstractNum w:abstractNumId="34" w15:restartNumberingAfterBreak="0">
     <w:nsid w:val="644D1E09"/>
     <w:multiLevelType w:val="hybridMultilevel"/>
     <w:tmpl w:val="CEA423CE"/>
@@ -56417,7 +56920,7 @@
       </w:pPr>
     </w:lvl>
   </w:abstractNum>
-  <w:abstractNum w:abstractNumId="31" w15:restartNumberingAfterBreak="0">
+  <w:abstractNum w:abstractNumId="35" w15:restartNumberingAfterBreak="0">
     <w:nsid w:val="6731205B"/>
     <w:multiLevelType w:val="hybridMultilevel"/>
     <w:tmpl w:val="DB4A4456"/>
@@ -56503,7 +57006,7 @@
       </w:pPr>
     </w:lvl>
   </w:abstractNum>
-  <w:abstractNum w:abstractNumId="32" w15:restartNumberingAfterBreak="0">
+  <w:abstractNum w:abstractNumId="36" w15:restartNumberingAfterBreak="0">
     <w:nsid w:val="681D6752"/>
     <w:multiLevelType w:val="hybridMultilevel"/>
     <w:tmpl w:val="1A00EAA8"/>
@@ -56589,7 +57092,7 @@
       </w:pPr>
     </w:lvl>
   </w:abstractNum>
-  <w:abstractNum w:abstractNumId="33" w15:restartNumberingAfterBreak="0">
+  <w:abstractNum w:abstractNumId="37" w15:restartNumberingAfterBreak="0">
     <w:nsid w:val="68D627C5"/>
     <w:multiLevelType w:val="hybridMultilevel"/>
     <w:tmpl w:val="4372FF9C"/>
@@ -56678,7 +57181,7 @@
       </w:pPr>
     </w:lvl>
   </w:abstractNum>
-  <w:abstractNum w:abstractNumId="34" w15:restartNumberingAfterBreak="0">
+  <w:abstractNum w:abstractNumId="38" w15:restartNumberingAfterBreak="0">
     <w:nsid w:val="68F141F0"/>
     <w:multiLevelType w:val="hybridMultilevel"/>
     <w:tmpl w:val="ADD67D46"/>
@@ -56764,7 +57267,7 @@
       </w:pPr>
     </w:lvl>
   </w:abstractNum>
-  <w:abstractNum w:abstractNumId="35" w15:restartNumberingAfterBreak="0">
+  <w:abstractNum w:abstractNumId="39" w15:restartNumberingAfterBreak="0">
     <w:nsid w:val="6AF213F0"/>
     <w:multiLevelType w:val="hybridMultilevel"/>
     <w:tmpl w:val="DCD09B34"/>
@@ -56853,7 +57356,7 @@
       </w:pPr>
     </w:lvl>
   </w:abstractNum>
-  <w:abstractNum w:abstractNumId="36" w15:restartNumberingAfterBreak="0">
+  <w:abstractNum w:abstractNumId="40" w15:restartNumberingAfterBreak="0">
     <w:nsid w:val="6D465FC6"/>
     <w:multiLevelType w:val="hybridMultilevel"/>
     <w:tmpl w:val="FB86C77C"/>
@@ -56939,7 +57442,7 @@
       </w:pPr>
     </w:lvl>
   </w:abstractNum>
-  <w:abstractNum w:abstractNumId="37" w15:restartNumberingAfterBreak="0">
+  <w:abstractNum w:abstractNumId="41" w15:restartNumberingAfterBreak="0">
     <w:nsid w:val="733E6563"/>
     <w:multiLevelType w:val="hybridMultilevel"/>
     <w:tmpl w:val="CB7625AA"/>
@@ -57025,7 +57528,7 @@
       </w:pPr>
     </w:lvl>
   </w:abstractNum>
-  <w:abstractNum w:abstractNumId="38" w15:restartNumberingAfterBreak="0">
+  <w:abstractNum w:abstractNumId="42" w15:restartNumberingAfterBreak="0">
     <w:nsid w:val="73CB1508"/>
     <w:multiLevelType w:val="hybridMultilevel"/>
     <w:tmpl w:val="03FE7A92"/>
@@ -57111,7 +57614,7 @@
       </w:pPr>
     </w:lvl>
   </w:abstractNum>
-  <w:abstractNum w:abstractNumId="39" w15:restartNumberingAfterBreak="0">
+  <w:abstractNum w:abstractNumId="43" w15:restartNumberingAfterBreak="0">
     <w:nsid w:val="79CC598B"/>
     <w:multiLevelType w:val="hybridMultilevel"/>
     <w:tmpl w:val="C76277D2"/>
@@ -57200,7 +57703,7 @@
       </w:pPr>
     </w:lvl>
   </w:abstractNum>
-  <w:abstractNum w:abstractNumId="40" w15:restartNumberingAfterBreak="0">
+  <w:abstractNum w:abstractNumId="44" w15:restartNumberingAfterBreak="0">
     <w:nsid w:val="7A5D1BB8"/>
     <w:multiLevelType w:val="hybridMultilevel"/>
     <w:tmpl w:val="1AC2E4AE"/>
@@ -57286,7 +57789,7 @@
       </w:pPr>
     </w:lvl>
   </w:abstractNum>
-  <w:abstractNum w:abstractNumId="41" w15:restartNumberingAfterBreak="0">
+  <w:abstractNum w:abstractNumId="45" w15:restartNumberingAfterBreak="0">
     <w:nsid w:val="7AD05631"/>
     <w:multiLevelType w:val="hybridMultilevel"/>
     <w:tmpl w:val="D0FCF810"/>
@@ -57372,7 +57875,7 @@
       </w:pPr>
     </w:lvl>
   </w:abstractNum>
-  <w:abstractNum w:abstractNumId="42" w15:restartNumberingAfterBreak="0">
+  <w:abstractNum w:abstractNumId="46" w15:restartNumberingAfterBreak="0">
     <w:nsid w:val="7BB82806"/>
     <w:multiLevelType w:val="hybridMultilevel"/>
     <w:tmpl w:val="43E8AC20"/>
@@ -57459,133 +57962,145 @@
     </w:lvl>
   </w:abstractNum>
   <w:num w:numId="1">
-    <w:abstractNumId w:val="21"/>
+    <w:abstractNumId w:val="25"/>
   </w:num>
   <w:num w:numId="2">
-    <w:abstractNumId w:val="25"/>
+    <w:abstractNumId w:val="29"/>
   </w:num>
   <w:num w:numId="3">
-    <w:abstractNumId w:val="1"/>
+    <w:abstractNumId w:val="2"/>
   </w:num>
   <w:num w:numId="4">
-    <w:abstractNumId w:val="35"/>
+    <w:abstractNumId w:val="39"/>
   </w:num>
   <w:num w:numId="5">
+    <w:abstractNumId w:val="8"/>
+  </w:num>
+  <w:num w:numId="6">
+    <w:abstractNumId w:val="37"/>
+  </w:num>
+  <w:num w:numId="7">
+    <w:abstractNumId w:val="36"/>
+  </w:num>
+  <w:num w:numId="8">
+    <w:abstractNumId w:val="30"/>
+  </w:num>
+  <w:num w:numId="9">
+    <w:abstractNumId w:val="26"/>
+  </w:num>
+  <w:num w:numId="10">
+    <w:abstractNumId w:val="17"/>
+  </w:num>
+  <w:num w:numId="11">
+    <w:abstractNumId w:val="31"/>
+  </w:num>
+  <w:num w:numId="12">
+    <w:abstractNumId w:val="20"/>
+  </w:num>
+  <w:num w:numId="13">
+    <w:abstractNumId w:val="13"/>
+  </w:num>
+  <w:num w:numId="14">
+    <w:abstractNumId w:val="43"/>
+  </w:num>
+  <w:num w:numId="15">
+    <w:abstractNumId w:val="3"/>
+  </w:num>
+  <w:num w:numId="16">
+    <w:abstractNumId w:val="18"/>
+  </w:num>
+  <w:num w:numId="17">
+    <w:abstractNumId w:val="4"/>
+  </w:num>
+  <w:num w:numId="18">
+    <w:abstractNumId w:val="38"/>
+  </w:num>
+  <w:num w:numId="19">
+    <w:abstractNumId w:val="28"/>
+  </w:num>
+  <w:num w:numId="20">
+    <w:abstractNumId w:val="34"/>
+  </w:num>
+  <w:num w:numId="21">
+    <w:abstractNumId w:val="24"/>
+  </w:num>
+  <w:num w:numId="22">
+    <w:abstractNumId w:val="16"/>
+  </w:num>
+  <w:num w:numId="23">
+    <w:abstractNumId w:val="40"/>
+  </w:num>
+  <w:num w:numId="24">
+    <w:abstractNumId w:val="42"/>
+  </w:num>
+  <w:num w:numId="25">
+    <w:abstractNumId w:val="14"/>
+  </w:num>
+  <w:num w:numId="26">
+    <w:abstractNumId w:val="11"/>
+  </w:num>
+  <w:num w:numId="27">
+    <w:abstractNumId w:val="27"/>
+  </w:num>
+  <w:num w:numId="28">
     <w:abstractNumId w:val="7"/>
   </w:num>
-  <w:num w:numId="6">
-    <w:abstractNumId w:val="33"/>
-  </w:num>
-  <w:num w:numId="7">
-    <w:abstractNumId w:val="32"/>
-  </w:num>
-  <w:num w:numId="8">
-    <w:abstractNumId w:val="26"/>
-  </w:num>
-  <w:num w:numId="9">
-    <w:abstractNumId w:val="22"/>
-  </w:num>
-  <w:num w:numId="10">
-    <w:abstractNumId w:val="13"/>
-  </w:num>
-  <w:num w:numId="11">
-    <w:abstractNumId w:val="27"/>
-  </w:num>
-  <w:num w:numId="12">
-    <w:abstractNumId w:val="16"/>
-  </w:num>
-  <w:num w:numId="13">
-    <w:abstractNumId w:val="10"/>
-  </w:num>
-  <w:num w:numId="14">
-    <w:abstractNumId w:val="39"/>
-  </w:num>
-  <w:num w:numId="15">
-    <w:abstractNumId w:val="2"/>
-  </w:num>
-  <w:num w:numId="16">
-    <w:abstractNumId w:val="14"/>
-  </w:num>
-  <w:num w:numId="17">
-    <w:abstractNumId w:val="3"/>
-  </w:num>
-  <w:num w:numId="18">
-    <w:abstractNumId w:val="34"/>
-  </w:num>
-  <w:num w:numId="19">
-    <w:abstractNumId w:val="24"/>
-  </w:num>
-  <w:num w:numId="20">
-    <w:abstractNumId w:val="30"/>
-  </w:num>
-  <w:num w:numId="21">
-    <w:abstractNumId w:val="20"/>
-  </w:num>
-  <w:num w:numId="22">
+  <w:num w:numId="29">
     <w:abstractNumId w:val="12"/>
   </w:num>
-  <w:num w:numId="23">
-    <w:abstractNumId w:val="36"/>
+  <w:num w:numId="30">
+    <w:abstractNumId w:val="46"/>
   </w:num>
-  <w:num w:numId="24">
-    <w:abstractNumId w:val="38"/>
+  <w:num w:numId="31">
+    <w:abstractNumId w:val="44"/>
   </w:num>
-  <w:num w:numId="25">
-    <w:abstractNumId w:val="11"/>
-  </w:num>
-  <w:num w:numId="26">
-    <w:abstractNumId w:val="8"/>
-  </w:num>
-  <w:num w:numId="27">
+  <w:num w:numId="32">
     <w:abstractNumId w:val="23"/>
   </w:num>
-  <w:num w:numId="28">
-    <w:abstractNumId w:val="6"/>
-  </w:num>
-  <w:num w:numId="29">
-    <w:abstractNumId w:val="9"/>
-  </w:num>
-  <w:num w:numId="30">
-    <w:abstractNumId w:val="42"/>
-  </w:num>
-  <w:num w:numId="31">
-    <w:abstractNumId w:val="40"/>
-  </w:num>
-  <w:num w:numId="32">
-    <w:abstractNumId w:val="19"/>
-  </w:num>
   <w:num w:numId="33">
-    <w:abstractNumId w:val="37"/>
+    <w:abstractNumId w:val="41"/>
   </w:num>
   <w:num w:numId="34">
     <w:abstractNumId w:val="0"/>
   </w:num>
   <w:num w:numId="35">
+    <w:abstractNumId w:val="19"/>
+  </w:num>
+  <w:num w:numId="36">
+    <w:abstractNumId w:val="33"/>
+  </w:num>
+  <w:num w:numId="37">
+    <w:abstractNumId w:val="21"/>
+  </w:num>
+  <w:num w:numId="38">
+    <w:abstractNumId w:val="32"/>
+  </w:num>
+  <w:num w:numId="39">
+    <w:abstractNumId w:val="35"/>
+  </w:num>
+  <w:num w:numId="40">
+    <w:abstractNumId w:val="5"/>
+  </w:num>
+  <w:num w:numId="41">
+    <w:abstractNumId w:val="6"/>
+  </w:num>
+  <w:num w:numId="42">
+    <w:abstractNumId w:val="45"/>
+  </w:num>
+  <w:num w:numId="43">
+    <w:abstractNumId w:val="22"/>
+  </w:num>
+  <w:num w:numId="44">
     <w:abstractNumId w:val="15"/>
   </w:num>
-  <w:num w:numId="36">
-    <w:abstractNumId w:val="29"/>
+  <w:num w:numId="45">
+    <w:abstractNumId w:val="1"/>
   </w:num>
-  <w:num w:numId="37">
-    <w:abstractNumId w:val="17"/>
+  <w:num w:numId="46">
+    <w:abstractNumId w:val="9"/>
   </w:num>
-  <w:num w:numId="38">
-    <w:abstractNumId w:val="28"/>
-  </w:num>
-  <w:num w:numId="39">
-    <w:abstractNumId w:val="31"/>
-  </w:num>
-  <w:num w:numId="40">
-    <w:abstractNumId w:val="4"/>
-  </w:num>
-  <w:num w:numId="41">
-    <w:abstractNumId w:val="5"/>
-  </w:num>
-  <w:num w:numId="42">
-    <w:abstractNumId w:val="41"/>
-  </w:num>
-  <w:num w:numId="43">
-    <w:abstractNumId w:val="18"/>
+  <w:num w:numId="47">
+    <w:abstractNumId w:val="10"/>
   </w:num>
   <w:numIdMacAtCleanup w:val="11"/>
 </w:numbering>
@@ -58787,7 +59302,7 @@
 </file>
 
 <file path=customXml/itemProps1.xml><?xml version="1.0" encoding="utf-8"?>
-<ds:datastoreItem xmlns:ds="http://schemas.openxmlformats.org/officeDocument/2006/customXml" ds:itemID="{4618CE78-9618-4B42-A92F-2C58687264E2}">
+<ds:datastoreItem xmlns:ds="http://schemas.openxmlformats.org/officeDocument/2006/customXml" ds:itemID="{EE7737B6-B034-4FEC-9083-B072A20220D6}">
   <ds:schemaRefs>
     <ds:schemaRef ds:uri="http://schemas.openxmlformats.org/officeDocument/2006/bibliography"/>
   </ds:schemaRefs>

</xml_diff>

<commit_message>
Tree Question selection Completed
</commit_message>
<xml_diff>
--- a/07. Tree/Tree.docx
+++ b/07. Tree/Tree.docx
@@ -9945,7 +9945,18 @@
     </w:p>
     <w:p>
       <w:r>
-        <w:t>Black question in video, add extra similar question to practice</w:t>
+        <w:t xml:space="preserve">Black question in video, add extra similar question to </w:t>
+      </w:r>
+      <w:proofErr w:type="gramStart"/>
+      <w:r>
+        <w:t>practice</w:t>
+      </w:r>
+      <w:r>
+        <w:t>(</w:t>
+      </w:r>
+      <w:proofErr w:type="gramEnd"/>
+      <w:r>
+        <w:t xml:space="preserve"> and in solutions as connected problem, plus end of section as additional problems to practice(small list type)</w:t>
       </w:r>
     </w:p>
     <w:p>
@@ -12527,7 +12538,14 @@
           <w:b/>
           <w:sz w:val="28"/>
         </w:rPr>
-        <w:t xml:space="preserve"> Advance Topics </w:t>
+        <w:t xml:space="preserve"> DP on Trees</w:t>
+      </w:r>
+      <w:r>
+        <w:rPr>
+          <w:b/>
+          <w:sz w:val="28"/>
+        </w:rPr>
+        <w:t xml:space="preserve"> </w:t>
       </w:r>
     </w:p>
     <w:p>
@@ -12537,30 +12555,51 @@
           <w:ilvl w:val="0"/>
           <w:numId w:val="42"/>
         </w:numPr>
-      </w:pPr>
-      <w:r>
+        <w:rPr>
+          <w:color w:val="FF0000"/>
+        </w:rPr>
+      </w:pPr>
+      <w:r>
+        <w:rPr>
+          <w:color w:val="FF0000"/>
+        </w:rPr>
         <w:t>Unique Binary Search Trees (96)</w:t>
       </w:r>
       <w:r>
+        <w:rPr>
+          <w:color w:val="FF0000"/>
+        </w:rPr>
         <w:tab/>
       </w:r>
       <w:proofErr w:type="spellStart"/>
       <w:r>
+        <w:rPr>
+          <w:color w:val="FF0000"/>
+        </w:rPr>
         <w:t>LeetCode</w:t>
       </w:r>
       <w:proofErr w:type="spellEnd"/>
       <w:r>
+        <w:rPr>
+          <w:color w:val="FF0000"/>
+        </w:rPr>
         <w:tab/>
       </w:r>
       <w:r>
         <w:rPr>
           <w:rFonts w:ascii="Calibri" w:hAnsi="Calibri" w:cs="Calibri"/>
+          <w:color w:val="FF0000"/>
         </w:rPr>
         <w:t>🟡</w:t>
       </w:r>
       <w:r>
+        <w:rPr>
+          <w:color w:val="FF0000"/>
+        </w:rPr>
         <w:t xml:space="preserve"> Medium</w:t>
       </w:r>
+      <w:bookmarkStart w:id="30" w:name="_GoBack"/>
+      <w:bookmarkEnd w:id="30"/>
     </w:p>
     <w:p>
       <w:pPr>
@@ -12569,29 +12608,48 @@
           <w:ilvl w:val="0"/>
           <w:numId w:val="42"/>
         </w:numPr>
-      </w:pPr>
-      <w:r>
-        <w:t>Unique Binary Search Trees II (95)</w:t>
-      </w:r>
-      <w:r>
+        <w:rPr>
+          <w:color w:val="FF0000"/>
+        </w:rPr>
+      </w:pPr>
+      <w:r>
+        <w:rPr>
+          <w:color w:val="FF0000"/>
+        </w:rPr>
+        <w:t>Binary Tree Maximum Path Sum (124)</w:t>
+      </w:r>
+      <w:r>
+        <w:rPr>
+          <w:color w:val="FF0000"/>
+        </w:rPr>
         <w:tab/>
       </w:r>
       <w:proofErr w:type="spellStart"/>
       <w:r>
+        <w:rPr>
+          <w:color w:val="FF0000"/>
+        </w:rPr>
         <w:t>LeetCode</w:t>
       </w:r>
       <w:proofErr w:type="spellEnd"/>
       <w:r>
+        <w:rPr>
+          <w:color w:val="FF0000"/>
+        </w:rPr>
         <w:tab/>
       </w:r>
       <w:r>
         <w:rPr>
-          <w:rFonts w:ascii="Calibri" w:hAnsi="Calibri" w:cs="Calibri"/>
-        </w:rPr>
-        <w:t>🟡</w:t>
-      </w:r>
-      <w:r>
-        <w:t xml:space="preserve"> Medium</w:t>
+          <w:rFonts w:ascii="Segoe UI Symbol" w:hAnsi="Segoe UI Symbol" w:cs="Segoe UI Symbol"/>
+          <w:color w:val="FF0000"/>
+        </w:rPr>
+        <w:t>🔴</w:t>
+      </w:r>
+      <w:r>
+        <w:rPr>
+          <w:color w:val="FF0000"/>
+        </w:rPr>
+        <w:t xml:space="preserve"> Hard (DP on tree)</w:t>
       </w:r>
     </w:p>
     <w:p>
@@ -12603,27 +12661,43 @@
         </w:numPr>
       </w:pPr>
       <w:r>
-        <w:t>Largest BST in Binary Tree</w:t>
-      </w:r>
-      <w:r>
+        <w:rPr>
+          <w:color w:val="FF0000"/>
+        </w:rPr>
+        <w:t>House Robber III (337)</w:t>
+      </w:r>
+      <w:r>
+        <w:rPr>
+          <w:color w:val="FF0000"/>
+        </w:rPr>
         <w:tab/>
       </w:r>
       <w:proofErr w:type="spellStart"/>
       <w:r>
-        <w:t>GeeksforGeeks</w:t>
+        <w:rPr>
+          <w:color w:val="FF0000"/>
+        </w:rPr>
+        <w:t>LeetCode</w:t>
       </w:r>
       <w:proofErr w:type="spellEnd"/>
       <w:r>
+        <w:rPr>
+          <w:color w:val="FF0000"/>
+        </w:rPr>
         <w:tab/>
       </w:r>
       <w:r>
         <w:rPr>
-          <w:rFonts w:ascii="Segoe UI Symbol" w:hAnsi="Segoe UI Symbol" w:cs="Segoe UI Symbol"/>
-        </w:rPr>
-        <w:t>🔴</w:t>
-      </w:r>
-      <w:r>
-        <w:t xml:space="preserve"> Hard</w:t>
+          <w:rFonts w:ascii="Calibri" w:hAnsi="Calibri" w:cs="Calibri"/>
+          <w:color w:val="FF0000"/>
+        </w:rPr>
+        <w:t>🟡</w:t>
+      </w:r>
+      <w:r>
+        <w:rPr>
+          <w:color w:val="FF0000"/>
+        </w:rPr>
+        <w:t xml:space="preserve"> Medium(DP on tree)</w:t>
       </w:r>
     </w:p>
     <w:p>
@@ -12633,29 +12707,48 @@
           <w:ilvl w:val="0"/>
           <w:numId w:val="42"/>
         </w:numPr>
-      </w:pPr>
-      <w:r>
-        <w:t>Binary Tree Maximum Path Sum (124)</w:t>
-      </w:r>
-      <w:r>
+        <w:rPr>
+          <w:color w:val="FF0000"/>
+        </w:rPr>
+      </w:pPr>
+      <w:r>
+        <w:rPr>
+          <w:color w:val="FF0000"/>
+        </w:rPr>
+        <w:t>Distribute Coins in Binary Tree (979)</w:t>
+      </w:r>
+      <w:r>
+        <w:rPr>
+          <w:color w:val="FF0000"/>
+        </w:rPr>
         <w:tab/>
       </w:r>
       <w:proofErr w:type="spellStart"/>
       <w:r>
+        <w:rPr>
+          <w:color w:val="FF0000"/>
+        </w:rPr>
         <w:t>LeetCode</w:t>
       </w:r>
       <w:proofErr w:type="spellEnd"/>
       <w:r>
+        <w:rPr>
+          <w:color w:val="FF0000"/>
+        </w:rPr>
         <w:tab/>
       </w:r>
       <w:r>
         <w:rPr>
-          <w:rFonts w:ascii="Segoe UI Symbol" w:hAnsi="Segoe UI Symbol" w:cs="Segoe UI Symbol"/>
-        </w:rPr>
-        <w:t>🔴</w:t>
-      </w:r>
-      <w:r>
-        <w:t xml:space="preserve"> Hard (DP on tree)</w:t>
+          <w:rFonts w:ascii="Calibri" w:hAnsi="Calibri" w:cs="Calibri"/>
+          <w:color w:val="FF0000"/>
+        </w:rPr>
+        <w:t>🟡</w:t>
+      </w:r>
+      <w:r>
+        <w:rPr>
+          <w:color w:val="FF0000"/>
+        </w:rPr>
+        <w:t xml:space="preserve"> Medium(DP on tree)</w:t>
       </w:r>
     </w:p>
     <w:p>
@@ -12665,164 +12758,54 @@
           <w:ilvl w:val="0"/>
           <w:numId w:val="42"/>
         </w:numPr>
-      </w:pPr>
-      <w:r>
-        <w:t>House Robber III (337)</w:t>
-      </w:r>
-      <w:r>
+        <w:rPr>
+          <w:color w:val="FF0000"/>
+        </w:rPr>
+      </w:pPr>
+      <w:r>
+        <w:rPr>
+          <w:color w:val="FF0000"/>
+        </w:rPr>
+        <w:t>Binary Tree Cameras (968)</w:t>
+      </w:r>
+      <w:r>
+        <w:rPr>
+          <w:color w:val="FF0000"/>
+        </w:rPr>
         <w:tab/>
       </w:r>
       <w:proofErr w:type="spellStart"/>
       <w:r>
+        <w:rPr>
+          <w:color w:val="FF0000"/>
+        </w:rPr>
         <w:t>LeetCode</w:t>
       </w:r>
       <w:proofErr w:type="spellEnd"/>
       <w:r>
+        <w:rPr>
+          <w:color w:val="FF0000"/>
+        </w:rPr>
         <w:tab/>
       </w:r>
       <w:r>
         <w:rPr>
-          <w:rFonts w:ascii="Calibri" w:hAnsi="Calibri" w:cs="Calibri"/>
-        </w:rPr>
-        <w:t>🟡</w:t>
-      </w:r>
-      <w:r>
-        <w:t xml:space="preserve"> Medium(DP on tree)</w:t>
-      </w:r>
-    </w:p>
-    <w:p>
-      <w:pPr>
-        <w:pStyle w:val="ListParagraph"/>
-        <w:numPr>
-          <w:ilvl w:val="0"/>
-          <w:numId w:val="42"/>
-        </w:numPr>
-      </w:pPr>
-      <w:r>
-        <w:t>Binary Tree Cameras (968)</w:t>
-      </w:r>
-      <w:r>
-        <w:tab/>
-      </w:r>
-      <w:proofErr w:type="spellStart"/>
-      <w:r>
-        <w:t>LeetCode</w:t>
-      </w:r>
-      <w:proofErr w:type="spellEnd"/>
-      <w:r>
-        <w:tab/>
-      </w:r>
-      <w:r>
-        <w:rPr>
           <w:rFonts w:ascii="Segoe UI Symbol" w:hAnsi="Segoe UI Symbol" w:cs="Segoe UI Symbol"/>
+          <w:color w:val="FF0000"/>
         </w:rPr>
         <w:t>🔴</w:t>
       </w:r>
       <w:r>
+        <w:rPr>
+          <w:color w:val="FF0000"/>
+        </w:rPr>
         <w:t xml:space="preserve"> Hard(DP on tree)</w:t>
       </w:r>
     </w:p>
-    <w:p>
-      <w:pPr>
-        <w:pStyle w:val="ListParagraph"/>
-        <w:numPr>
-          <w:ilvl w:val="0"/>
-          <w:numId w:val="42"/>
-        </w:numPr>
-      </w:pPr>
-      <w:r>
-        <w:t>Distribute Coins in Binary Tree (979)</w:t>
-      </w:r>
-      <w:r>
-        <w:tab/>
-      </w:r>
-      <w:proofErr w:type="spellStart"/>
-      <w:r>
-        <w:t>LeetCode</w:t>
-      </w:r>
-      <w:proofErr w:type="spellEnd"/>
-      <w:r>
-        <w:tab/>
-      </w:r>
-      <w:r>
-        <w:rPr>
-          <w:rFonts w:ascii="Calibri" w:hAnsi="Calibri" w:cs="Calibri"/>
-        </w:rPr>
-        <w:t>🟡</w:t>
-      </w:r>
-      <w:r>
-        <w:t xml:space="preserve"> Medium(DP on tree)</w:t>
-      </w:r>
-    </w:p>
-    <w:p>
-      <w:pPr>
-        <w:pStyle w:val="ListParagraph"/>
-        <w:numPr>
-          <w:ilvl w:val="0"/>
-          <w:numId w:val="42"/>
-        </w:numPr>
-      </w:pPr>
-      <w:r>
-        <w:t>Children Sum Property</w:t>
-      </w:r>
-      <w:r>
-        <w:tab/>
-      </w:r>
-      <w:proofErr w:type="spellStart"/>
-      <w:r>
-        <w:t>GeeksforGeeks</w:t>
-      </w:r>
-      <w:proofErr w:type="spellEnd"/>
-      <w:r>
-        <w:tab/>
-      </w:r>
-      <w:r>
-        <w:rPr>
-          <w:rFonts w:ascii="Calibri" w:hAnsi="Calibri" w:cs="Calibri"/>
-        </w:rPr>
-        <w:t>🟡</w:t>
-      </w:r>
-      <w:r>
-        <w:t xml:space="preserve"> Medium</w:t>
-      </w:r>
-    </w:p>
-    <w:p>
-      <w:pPr>
-        <w:pStyle w:val="ListParagraph"/>
-        <w:numPr>
-          <w:ilvl w:val="0"/>
-          <w:numId w:val="42"/>
-        </w:numPr>
-      </w:pPr>
-      <w:r>
-        <w:t>Burn a Binary Tree</w:t>
-      </w:r>
-      <w:r>
-        <w:tab/>
-      </w:r>
-      <w:proofErr w:type="spellStart"/>
-      <w:r>
-        <w:t>GeeksforGeeks</w:t>
-      </w:r>
-      <w:proofErr w:type="spellEnd"/>
-      <w:r>
-        <w:tab/>
-      </w:r>
-      <w:r>
-        <w:rPr>
-          <w:rFonts w:ascii="Segoe UI Symbol" w:hAnsi="Segoe UI Symbol" w:cs="Segoe UI Symbol"/>
-        </w:rPr>
-        <w:t>🔴</w:t>
-      </w:r>
-      <w:r>
-        <w:t xml:space="preserve"> Hard</w:t>
-      </w:r>
-    </w:p>
     <w:p/>
-    <w:p>
-      <w:bookmarkStart w:id="30" w:name="_GoBack"/>
-      <w:bookmarkEnd w:id="30"/>
-    </w:p>
+    <w:p/>
+    <w:p/>
+    <w:p/>
     <w:p>
       <w:pPr>
         <w:pStyle w:val="Heading1"/>
@@ -53626,7 +53609,7 @@
         <w:noProof/>
         <w:color w:val="404040" w:themeColor="text1" w:themeTint="BF"/>
       </w:rPr>
-      <w:t>13</w:t>
+      <w:t>21</w:t>
     </w:r>
     <w:r>
       <w:rPr>
@@ -59302,7 +59285,7 @@
 </file>
 
 <file path=customXml/itemProps1.xml><?xml version="1.0" encoding="utf-8"?>
-<ds:datastoreItem xmlns:ds="http://schemas.openxmlformats.org/officeDocument/2006/customXml" ds:itemID="{EE7737B6-B034-4FEC-9083-B072A20220D6}">
+<ds:datastoreItem xmlns:ds="http://schemas.openxmlformats.org/officeDocument/2006/customXml" ds:itemID="{205676EE-6D4A-47F2-B5DE-6C0527B94B97}">
   <ds:schemaRefs>
     <ds:schemaRef ds:uri="http://schemas.openxmlformats.org/officeDocument/2006/bibliography"/>
   </ds:schemaRefs>

</xml_diff>